<commit_message>
Fix philosophy trigger logic for Haidian spaceflight item
</commit_message>
<xml_diff>
--- a/reports/final_deliverables/必修四哲学_深层触发点版_2026-04-27/outputs/必修四哲学材料-知识触发总框架_深层触发点版_2026-04-27.docx
+++ b/reports/final_deliverables/必修四哲学_深层触发点版_2026-04-27/outputs/必修四哲学材料-知识触发总框架_深层触发点版_2026-04-27.docx
@@ -215,7 +215,7 @@
           <w:b w:val="0"/>
           <w:sz w:val="20"/>
         </w:rPr>
-        <w:t>物质与意识的辩证关系 / 意识对物质具有能动作用</w:t>
+        <w:t>物质决定意识，意识对物质具有能动作用</w:t>
       </w:r>
     </w:p>
     <w:p>
@@ -486,7 +486,7 @@
           <w:b w:val="0"/>
           <w:sz w:val="20"/>
         </w:rPr>
-        <w:t>一切从实际出发 / 尊重规律与发挥主观能动性 / 联系系统 / 发展观点 / 辩证否定 / 人民群众 / 价值观导向</w:t>
+        <w:t>一切从实际出发 / 实事求是</w:t>
       </w:r>
     </w:p>
     <w:p>
@@ -748,7 +748,7 @@
           <w:b w:val="0"/>
           <w:sz w:val="20"/>
         </w:rPr>
-        <w:t>联系观点 / 系统观念 / 意识能动作用 / 从实际出发和遵循社会发展规律</w:t>
+        <w:t>一切从实际出发 / 实事求是</w:t>
       </w:r>
     </w:p>
     <w:p>
@@ -862,7 +862,7 @@
           <w:b w:val="0"/>
           <w:sz w:val="20"/>
         </w:rPr>
-        <w:t>从实际出发 / 社会存在决定社会意识 / 价值判断与价值选择</w:t>
+        <w:t>一切从实际出发 / 实事求是</w:t>
       </w:r>
     </w:p>
     <w:p>
@@ -976,7 +976,7 @@
           <w:b w:val="0"/>
           <w:sz w:val="20"/>
         </w:rPr>
-        <w:t>一切从实际出发 / 联系观点 / 系统观念</w:t>
+        <w:t>一切从实际出发 / 实事求是</w:t>
       </w:r>
     </w:p>
     <w:p>
@@ -1090,7 +1090,7 @@
           <w:b w:val="0"/>
           <w:sz w:val="20"/>
         </w:rPr>
-        <w:t>一切从实际出发 / 具体问题具体分析 / 尊重客观规律</w:t>
+        <w:t>一切从实际出发 / 实事求是</w:t>
       </w:r>
     </w:p>
     <w:p>
@@ -1221,7 +1221,7 @@
           <w:b w:val="0"/>
           <w:sz w:val="20"/>
         </w:rPr>
-        <w:t>一切从实际出发 / 实事求是 / 具体问题具体分析</w:t>
+        <w:t>一切从实际出发 / 实事求是</w:t>
       </w:r>
     </w:p>
     <w:p>
@@ -1335,7 +1335,7 @@
           <w:b w:val="0"/>
           <w:sz w:val="20"/>
         </w:rPr>
-        <w:t>实践观点 / 群众观点 / 实事求是</w:t>
+        <w:t>一切从实际出发 / 实事求是</w:t>
       </w:r>
     </w:p>
     <w:p>
@@ -1449,7 +1449,7 @@
           <w:b w:val="0"/>
           <w:sz w:val="20"/>
         </w:rPr>
-        <w:t>矛盾特殊性 / 一切从实际出发 / 守正创新</w:t>
+        <w:t>一切从实际出发 / 实事求是</w:t>
       </w:r>
     </w:p>
     <w:p>
@@ -1939,7 +1939,7 @@
           <w:b w:val="0"/>
           <w:sz w:val="20"/>
         </w:rPr>
-        <w:t>主观与客观、认识与实践具体的历史的统一</w:t>
+        <w:t>一切从实际出发 / 实事求是</w:t>
       </w:r>
     </w:p>
     <w:p>
@@ -2070,7 +2070,7 @@
           <w:b w:val="0"/>
           <w:sz w:val="20"/>
         </w:rPr>
-        <w:t>一切从实际出发 / 具体问题具体分析 / 实践与认识</w:t>
+        <w:t>一切从实际出发 / 实事求是</w:t>
       </w:r>
     </w:p>
     <w:p>
@@ -2184,7 +2184,7 @@
           <w:b w:val="0"/>
           <w:sz w:val="20"/>
         </w:rPr>
-        <w:t>一切从实际出发 / 具体问题具体分析 / 群众观点</w:t>
+        <w:t>一切从实际出发 / 实事求是</w:t>
       </w:r>
     </w:p>
     <w:p>
@@ -2526,7 +2526,7 @@
           <w:b w:val="0"/>
           <w:sz w:val="20"/>
         </w:rPr>
-        <w:t>追求真理 / 真理是主观与客观相符合</w:t>
+        <w:t>一切从实际出发 / 实事求是</w:t>
       </w:r>
     </w:p>
     <w:p>
@@ -2680,7 +2680,7 @@
           <w:b w:val="0"/>
           <w:sz w:val="20"/>
         </w:rPr>
-        <w:t>五年规划触发点在在广泛汇集民意、把握发展实际、回应阶段任务的基础上形成，并在实践中根据情况变化优化推进；评标 PPT 明确可从“实事求是”作答，因此这道题应补入从实际出发栏目</w:t>
+        <w:t>五年规划触发点在广泛汇集民意、把握发展实际、回应阶段任务的基础上形成，并在实践中根据情况变化优化推进；评标 PPT 明确可从“实事求是”作答，因此这道题应补入从实际出发栏目</w:t>
       </w:r>
     </w:p>
     <w:p>
@@ -2788,7 +2788,7 @@
           <w:b w:val="0"/>
           <w:sz w:val="20"/>
         </w:rPr>
-        <w:t>一切从实际出发 / 尊重客观规律与发挥主观能动性</w:t>
+        <w:t>一切从实际出发 / 实事求是</w:t>
       </w:r>
     </w:p>
     <w:p>
@@ -2811,7 +2811,7 @@
           <w:b w:val="0"/>
           <w:sz w:val="20"/>
         </w:rPr>
-        <w:t>讲评 PPT 明确给出唯物论角度；都江堰的智慧触发点在在把握地形、水势等客观条件基础上主动设计工程，实现人与自然和谐共生</w:t>
+        <w:t>讲评 PPT 明确给出唯物论角度；都江堰的智慧触发点在把握地形、水势等客观条件基础上主动设计工程，实现人与自然和谐共生</w:t>
       </w:r>
     </w:p>
     <w:p>
@@ -2911,7 +2911,7 @@
           <w:b w:val="0"/>
           <w:sz w:val="20"/>
         </w:rPr>
-        <w:t>实践观点 / 主观能动性 / 发展观点</w:t>
+        <w:t>主观能动性 / 意识的能动作用</w:t>
       </w:r>
     </w:p>
     <w:p>
@@ -2934,7 +2934,7 @@
           <w:b w:val="0"/>
           <w:sz w:val="20"/>
         </w:rPr>
-        <w:t>中国人的自信触发点在建立在航天实践积累、关键技术突破和阶段性目标推进之上；材料提示学生把“有基础、有方案、有进展”写成实践基础和发展过程</w:t>
+        <w:t>“登陆月球成为下一个目标”体现目标设定；“关键技术攻关、方案研制、初样研制”体现围绕目标展开计划和行动，把认识和方案转化为现实工程，所以对应有目的、有计划地发挥主观能动性。</w:t>
       </w:r>
     </w:p>
     <w:p>
@@ -2979,7 +2979,7 @@
           <w:b w:val="0"/>
           <w:sz w:val="21"/>
         </w:rPr>
-        <w:t>原文：“揽月”取自毛泽东诗词“可上九天揽月”，彰显中国人探索宇宙、登陆月球的自信</w:t>
+        <w:t>正确项：正确发挥主观能动性、从事物固有联系中把握事物造福人类</w:t>
       </w:r>
     </w:p>
     <w:p>
@@ -3002,7 +3002,7 @@
           <w:b w:val="0"/>
           <w:sz w:val="20"/>
         </w:rPr>
-        <w:t>“揽月”取自毛泽东诗词“可上九天揽月”，彰显中国人探索宇宙、登陆月球的自信</w:t>
+        <w:t>脑机接口通过记录和解读大脑信号，建立大脑与外部设备的直接通信，帮助截瘫患者用意念控制光标和气动手套</w:t>
       </w:r>
     </w:p>
     <w:p>
@@ -3025,7 +3025,7 @@
           <w:b w:val="0"/>
           <w:sz w:val="20"/>
         </w:rPr>
-        <w:t>民族精神 / 文化自信 / 意识能动作用</w:t>
+        <w:t>主观能动性 / 意识的能动作用</w:t>
       </w:r>
     </w:p>
     <w:p>
@@ -3048,7 +3048,7 @@
           <w:b w:val="0"/>
           <w:sz w:val="20"/>
         </w:rPr>
-        <w:t>诗词意象进入航天器命名，说明中华文化中的理想气魄、奋斗精神和浪漫想象能够激励现实探索；文化自信要落到“精神动力转化为实践行动”，不能只写一句喜欢传统文化</w:t>
+        <w:t>正确项落在正确发挥主观能动性、从事物固有联系中把握事物造福人类；材料中的“建立通信”触发点在认识脑信号、外部设备和人体需求之间客观联系基础上，创造条件服务人的生活</w:t>
       </w:r>
     </w:p>
     <w:p>
@@ -3071,7 +3071,7 @@
           <w:b w:val="0"/>
           <w:sz w:val="20"/>
         </w:rPr>
-        <w:t>2024北京海淀高三一模 第16题；B评标/讲评角度清单；材料链为整理者解释</w:t>
+        <w:t>2024北京海淀高三一模 第2题；C选择题正确项；有可靠答案源</w:t>
       </w:r>
     </w:p>
     <w:p>
@@ -3093,7 +3093,7 @@
           <w:b w:val="0"/>
           <w:sz w:val="21"/>
         </w:rPr>
-        <w:t>正确项：正确发挥主观能动性、从事物固有联系中把握事物造福人类</w:t>
+        <w:t>段意触发：整段突出人的认识、规划、选择或创造：城市公园不筛选观赏植物、不修剪成规整绿地，而是搜集不同土壤、把种植权交给自然，让风、鸟、昆虫和土壤里的种子共同塑造生态</w:t>
       </w:r>
     </w:p>
     <w:p>
@@ -3116,7 +3116,7 @@
           <w:b w:val="0"/>
           <w:sz w:val="20"/>
         </w:rPr>
-        <w:t>脑机接口通过记录和解读大脑信号，建立大脑与外部设备的直接通信，帮助截瘫患者用意念控制光标和气动手套</w:t>
+        <w:t>城市公园不筛选观赏植物、不修剪成规整绿地，而是搜集不同土壤、把种植权交给自然，让风、鸟、昆虫和土壤里的种子共同塑造生态</w:t>
       </w:r>
     </w:p>
     <w:p>
@@ -3139,7 +3139,7 @@
           <w:b w:val="0"/>
           <w:sz w:val="20"/>
         </w:rPr>
-        <w:t>联系观点 / 主观能动性 / 科技实践</w:t>
+        <w:t>主观能动性 / 意识的能动作用</w:t>
       </w:r>
     </w:p>
     <w:p>
@@ -3162,7 +3162,7 @@
           <w:b w:val="0"/>
           <w:sz w:val="20"/>
         </w:rPr>
-        <w:t>正确项落在正确发挥主观能动性、从事物固有联系中把握事物造福人类；材料中的“建立通信”触发点在在认识脑信号、外部设备和人体需求之间客观联系基础上，创造条件服务人的生活</w:t>
+        <w:t>材料批判人类中心主义，触发点在要求人的实践以尊重自然规律为前提，在认识生态系统自组织规律后选择少干预、适度干预</w:t>
       </w:r>
     </w:p>
     <w:p>
@@ -3185,7 +3185,7 @@
           <w:b w:val="0"/>
           <w:sz w:val="20"/>
         </w:rPr>
-        <w:t>2024北京海淀高三一模 第2题；C选择题正确项；有可靠答案源</w:t>
+        <w:t>2024北京西城高三一模 第17题；A细则/阅卷/评分标准直接支持</w:t>
       </w:r>
     </w:p>
     <w:p>
@@ -3200,120 +3200,6 @@
           <w:sz w:val="21"/>
         </w:rPr>
         <w:t>4. 真正触发点：</w:t>
-      </w:r>
-      <w:r>
-        <w:rPr>
-          <w:rFonts w:ascii="Songti SC" w:hAnsi="Songti SC" w:eastAsia="Songti SC"/>
-          <w:b w:val="0"/>
-          <w:sz w:val="21"/>
-        </w:rPr>
-        <w:t>段意触发：整段突出人的认识、规划、选择或创造：城市公园不筛选观赏植物、不修剪成规整绿地，而是搜集不同土壤、把种植权交给自然，让风、鸟、昆虫和土壤里的种子共同塑造生态</w:t>
-      </w:r>
-    </w:p>
-    <w:p>
-      <w:pPr>
-        <w:spacing w:after="40" w:line="259" w:lineRule="auto"/>
-        <w:ind w:left="312"/>
-      </w:pPr>
-      <w:r>
-        <w:rPr>
-          <w:rFonts w:ascii="Songti SC" w:hAnsi="Songti SC" w:eastAsia="Songti SC"/>
-          <w:b/>
-          <w:color w:val="1F4E79"/>
-          <w:sz w:val="20"/>
-        </w:rPr>
-        <w:t>相关材料：</w:t>
-      </w:r>
-      <w:r>
-        <w:rPr>
-          <w:rFonts w:ascii="Songti SC" w:hAnsi="Songti SC" w:eastAsia="Songti SC"/>
-          <w:b w:val="0"/>
-          <w:sz w:val="20"/>
-        </w:rPr>
-        <w:t>城市公园不筛选观赏植物、不修剪成规整绿地，而是搜集不同土壤、把种植权交给自然，让风、鸟、昆虫和土壤里的种子共同塑造生态</w:t>
-      </w:r>
-    </w:p>
-    <w:p>
-      <w:pPr>
-        <w:spacing w:after="40" w:line="259" w:lineRule="auto"/>
-        <w:ind w:left="312"/>
-      </w:pPr>
-      <w:r>
-        <w:rPr>
-          <w:rFonts w:ascii="Songti SC" w:hAnsi="Songti SC" w:eastAsia="Songti SC"/>
-          <w:b/>
-          <w:color w:val="1F4E79"/>
-          <w:sz w:val="20"/>
-        </w:rPr>
-        <w:t>触发知识：</w:t>
-      </w:r>
-      <w:r>
-        <w:rPr>
-          <w:rFonts w:ascii="Songti SC" w:hAnsi="Songti SC" w:eastAsia="Songti SC"/>
-          <w:b w:val="0"/>
-          <w:sz w:val="20"/>
-        </w:rPr>
-        <w:t>规律客观性 / 主观能动性 / 实践观点</w:t>
-      </w:r>
-    </w:p>
-    <w:p>
-      <w:pPr>
-        <w:spacing w:after="40" w:line="259" w:lineRule="auto"/>
-        <w:ind w:left="312"/>
-      </w:pPr>
-      <w:r>
-        <w:rPr>
-          <w:rFonts w:ascii="Songti SC" w:hAnsi="Songti SC" w:eastAsia="Songti SC"/>
-          <w:b/>
-          <w:color w:val="1F4E79"/>
-          <w:sz w:val="20"/>
-        </w:rPr>
-        <w:t>为什么触发：</w:t>
-      </w:r>
-      <w:r>
-        <w:rPr>
-          <w:rFonts w:ascii="Songti SC" w:hAnsi="Songti SC" w:eastAsia="Songti SC"/>
-          <w:b w:val="0"/>
-          <w:sz w:val="20"/>
-        </w:rPr>
-        <w:t>材料批判人类中心主义，触发点在要求人的实践以尊重自然规律为前提，在认识生态系统自组织规律后选择少干预、适度干预</w:t>
-      </w:r>
-    </w:p>
-    <w:p>
-      <w:pPr>
-        <w:spacing w:after="40" w:line="259" w:lineRule="auto"/>
-        <w:ind w:left="312"/>
-      </w:pPr>
-      <w:r>
-        <w:rPr>
-          <w:rFonts w:ascii="Songti SC" w:hAnsi="Songti SC" w:eastAsia="Songti SC"/>
-          <w:b/>
-          <w:color w:val="1F4E79"/>
-          <w:sz w:val="20"/>
-        </w:rPr>
-        <w:t>来源与证据：</w:t>
-      </w:r>
-      <w:r>
-        <w:rPr>
-          <w:rFonts w:ascii="Songti SC" w:hAnsi="Songti SC" w:eastAsia="Songti SC"/>
-          <w:b w:val="0"/>
-          <w:sz w:val="20"/>
-        </w:rPr>
-        <w:t>2024北京西城高三一模 第17题；A细则/阅卷/评分标准直接支持</w:t>
-      </w:r>
-    </w:p>
-    <w:p>
-      <w:pPr>
-        <w:spacing w:before="100" w:after="40"/>
-      </w:pPr>
-      <w:r>
-        <w:rPr>
-          <w:rFonts w:ascii="Songti SC" w:hAnsi="Songti SC" w:eastAsia="Songti SC"/>
-          <w:b/>
-          <w:color w:val="1F4E79"/>
-          <w:sz w:val="21"/>
-        </w:rPr>
-        <w:t>5. 真正触发点：</w:t>
       </w:r>
       <w:r>
         <w:rPr>
@@ -3444,121 +3330,121 @@
           <w:color w:val="1F4E79"/>
           <w:sz w:val="21"/>
         </w:rPr>
+        <w:t>5. 真正触发点：</w:t>
+      </w:r>
+      <w:r>
+        <w:rPr>
+          <w:rFonts w:ascii="Songti SC" w:hAnsi="Songti SC" w:eastAsia="Songti SC"/>
+          <w:b w:val="0"/>
+          <w:sz w:val="21"/>
+        </w:rPr>
+        <w:t>正确项：“梦舟”“揽月”等命名以文化意象表达航天梦想和中国式浪漫</w:t>
+      </w:r>
+    </w:p>
+    <w:p>
+      <w:pPr>
+        <w:spacing w:after="40" w:line="259" w:lineRule="auto"/>
+        <w:ind w:left="312"/>
+      </w:pPr>
+      <w:r>
+        <w:rPr>
+          <w:rFonts w:ascii="Songti SC" w:hAnsi="Songti SC" w:eastAsia="Songti SC"/>
+          <w:b/>
+          <w:color w:val="1F4E79"/>
+          <w:sz w:val="20"/>
+        </w:rPr>
+        <w:t>相关材料：</w:t>
+      </w:r>
+      <w:r>
+        <w:rPr>
+          <w:rFonts w:ascii="Songti SC" w:hAnsi="Songti SC" w:eastAsia="Songti SC"/>
+          <w:b w:val="0"/>
+          <w:sz w:val="20"/>
+        </w:rPr>
+        <w:t>“梦舟”“揽月”等命名以文化意象表达航天梦想和中国式浪漫</w:t>
+      </w:r>
+    </w:p>
+    <w:p>
+      <w:pPr>
+        <w:spacing w:after="40" w:line="259" w:lineRule="auto"/>
+        <w:ind w:left="312"/>
+      </w:pPr>
+      <w:r>
+        <w:rPr>
+          <w:rFonts w:ascii="Songti SC" w:hAnsi="Songti SC" w:eastAsia="Songti SC"/>
+          <w:b/>
+          <w:color w:val="1F4E79"/>
+          <w:sz w:val="20"/>
+        </w:rPr>
+        <w:t>触发知识：</w:t>
+      </w:r>
+      <w:r>
+        <w:rPr>
+          <w:rFonts w:ascii="Songti SC" w:hAnsi="Songti SC" w:eastAsia="Songti SC"/>
+          <w:b w:val="0"/>
+          <w:sz w:val="20"/>
+        </w:rPr>
+        <w:t>主观能动性 / 意识的能动作用</w:t>
+      </w:r>
+    </w:p>
+    <w:p>
+      <w:pPr>
+        <w:spacing w:after="40" w:line="259" w:lineRule="auto"/>
+        <w:ind w:left="312"/>
+      </w:pPr>
+      <w:r>
+        <w:rPr>
+          <w:rFonts w:ascii="Songti SC" w:hAnsi="Songti SC" w:eastAsia="Songti SC"/>
+          <w:b/>
+          <w:color w:val="1F4E79"/>
+          <w:sz w:val="20"/>
+        </w:rPr>
+        <w:t>为什么触发：</w:t>
+      </w:r>
+      <w:r>
+        <w:rPr>
+          <w:rFonts w:ascii="Songti SC" w:hAnsi="Songti SC" w:eastAsia="Songti SC"/>
+          <w:b w:val="0"/>
+          <w:sz w:val="20"/>
+        </w:rPr>
+        <w:t>命名借助想象、联想和文化意象把航天工程与民族文化记忆连接，体现意识活动的主动创造和文化表达；不能误写为抽象思维或必然联系</w:t>
+      </w:r>
+    </w:p>
+    <w:p>
+      <w:pPr>
+        <w:spacing w:after="40" w:line="259" w:lineRule="auto"/>
+        <w:ind w:left="312"/>
+      </w:pPr>
+      <w:r>
+        <w:rPr>
+          <w:rFonts w:ascii="Songti SC" w:hAnsi="Songti SC" w:eastAsia="Songti SC"/>
+          <w:b/>
+          <w:color w:val="1F4E79"/>
+          <w:sz w:val="20"/>
+        </w:rPr>
+        <w:t>来源与证据：</w:t>
+      </w:r>
+      <w:r>
+        <w:rPr>
+          <w:rFonts w:ascii="Songti SC" w:hAnsi="Songti SC" w:eastAsia="Songti SC"/>
+          <w:b w:val="0"/>
+          <w:sz w:val="20"/>
+        </w:rPr>
+        <w:t>2024北京顺义高三二模 第2题③④；C选择题正确项；有可靠答案源</w:t>
+      </w:r>
+    </w:p>
+    <w:p>
+      <w:pPr>
+        <w:spacing w:before="100" w:after="40"/>
+      </w:pPr>
+      <w:r>
+        <w:rPr>
+          <w:rFonts w:ascii="Songti SC" w:hAnsi="Songti SC" w:eastAsia="Songti SC"/>
+          <w:b/>
+          <w:color w:val="1F4E79"/>
+          <w:sz w:val="21"/>
+        </w:rPr>
         <w:t>6. 真正触发点：</w:t>
-      </w:r>
-      <w:r>
-        <w:rPr>
-          <w:rFonts w:ascii="Songti SC" w:hAnsi="Songti SC" w:eastAsia="Songti SC"/>
-          <w:b w:val="0"/>
-          <w:sz w:val="21"/>
-        </w:rPr>
-        <w:t>正确项：“梦舟”“揽月”等命名以文化意象表达航天梦想和中国式浪漫</w:t>
-      </w:r>
-    </w:p>
-    <w:p>
-      <w:pPr>
-        <w:spacing w:after="40" w:line="259" w:lineRule="auto"/>
-        <w:ind w:left="312"/>
-      </w:pPr>
-      <w:r>
-        <w:rPr>
-          <w:rFonts w:ascii="Songti SC" w:hAnsi="Songti SC" w:eastAsia="Songti SC"/>
-          <w:b/>
-          <w:color w:val="1F4E79"/>
-          <w:sz w:val="20"/>
-        </w:rPr>
-        <w:t>相关材料：</w:t>
-      </w:r>
-      <w:r>
-        <w:rPr>
-          <w:rFonts w:ascii="Songti SC" w:hAnsi="Songti SC" w:eastAsia="Songti SC"/>
-          <w:b w:val="0"/>
-          <w:sz w:val="20"/>
-        </w:rPr>
-        <w:t>“梦舟”“揽月”等命名以文化意象表达航天梦想和中国式浪漫</w:t>
-      </w:r>
-    </w:p>
-    <w:p>
-      <w:pPr>
-        <w:spacing w:after="40" w:line="259" w:lineRule="auto"/>
-        <w:ind w:left="312"/>
-      </w:pPr>
-      <w:r>
-        <w:rPr>
-          <w:rFonts w:ascii="Songti SC" w:hAnsi="Songti SC" w:eastAsia="Songti SC"/>
-          <w:b/>
-          <w:color w:val="1F4E79"/>
-          <w:sz w:val="20"/>
-        </w:rPr>
-        <w:t>触发知识：</w:t>
-      </w:r>
-      <w:r>
-        <w:rPr>
-          <w:rFonts w:ascii="Songti SC" w:hAnsi="Songti SC" w:eastAsia="Songti SC"/>
-          <w:b w:val="0"/>
-          <w:sz w:val="20"/>
-        </w:rPr>
-        <w:t>意识活动的能动创造性 / 文化符号表达</w:t>
-      </w:r>
-    </w:p>
-    <w:p>
-      <w:pPr>
-        <w:spacing w:after="40" w:line="259" w:lineRule="auto"/>
-        <w:ind w:left="312"/>
-      </w:pPr>
-      <w:r>
-        <w:rPr>
-          <w:rFonts w:ascii="Songti SC" w:hAnsi="Songti SC" w:eastAsia="Songti SC"/>
-          <w:b/>
-          <w:color w:val="1F4E79"/>
-          <w:sz w:val="20"/>
-        </w:rPr>
-        <w:t>为什么触发：</w:t>
-      </w:r>
-      <w:r>
-        <w:rPr>
-          <w:rFonts w:ascii="Songti SC" w:hAnsi="Songti SC" w:eastAsia="Songti SC"/>
-          <w:b w:val="0"/>
-          <w:sz w:val="20"/>
-        </w:rPr>
-        <w:t>命名借助想象、联想和文化意象把航天工程与民族文化记忆连接，体现意识活动的主动创造和文化表达；不能误写为抽象思维或必然联系</w:t>
-      </w:r>
-    </w:p>
-    <w:p>
-      <w:pPr>
-        <w:spacing w:after="40" w:line="259" w:lineRule="auto"/>
-        <w:ind w:left="312"/>
-      </w:pPr>
-      <w:r>
-        <w:rPr>
-          <w:rFonts w:ascii="Songti SC" w:hAnsi="Songti SC" w:eastAsia="Songti SC"/>
-          <w:b/>
-          <w:color w:val="1F4E79"/>
-          <w:sz w:val="20"/>
-        </w:rPr>
-        <w:t>来源与证据：</w:t>
-      </w:r>
-      <w:r>
-        <w:rPr>
-          <w:rFonts w:ascii="Songti SC" w:hAnsi="Songti SC" w:eastAsia="Songti SC"/>
-          <w:b w:val="0"/>
-          <w:sz w:val="20"/>
-        </w:rPr>
-        <w:t>2024北京顺义高三二模 第2题③④；C选择题正确项；有可靠答案源</w:t>
-      </w:r>
-    </w:p>
-    <w:p>
-      <w:pPr>
-        <w:spacing w:before="100" w:after="40"/>
-      </w:pPr>
-      <w:r>
-        <w:rPr>
-          <w:rFonts w:ascii="Songti SC" w:hAnsi="Songti SC" w:eastAsia="Songti SC"/>
-          <w:b/>
-          <w:color w:val="1F4E79"/>
-          <w:sz w:val="21"/>
-        </w:rPr>
-        <w:t>7. 真正触发点：</w:t>
       </w:r>
       <w:r>
         <w:rPr>
@@ -3689,6 +3575,120 @@
           <w:color w:val="1F4E79"/>
           <w:sz w:val="21"/>
         </w:rPr>
+        <w:t>7. 真正触发点：</w:t>
+      </w:r>
+      <w:r>
+        <w:rPr>
+          <w:rFonts w:ascii="Songti SC" w:hAnsi="Songti SC" w:eastAsia="Songti SC"/>
+          <w:b w:val="0"/>
+          <w:sz w:val="21"/>
+        </w:rPr>
+        <w:t>段意触发：整段突出人的认识、规划、选择或创造：打造中医药新时尚，把中医药传统理念与现代烘焙、消费需求结合</w:t>
+      </w:r>
+    </w:p>
+    <w:p>
+      <w:pPr>
+        <w:spacing w:after="40" w:line="259" w:lineRule="auto"/>
+        <w:ind w:left="312"/>
+      </w:pPr>
+      <w:r>
+        <w:rPr>
+          <w:rFonts w:ascii="Songti SC" w:hAnsi="Songti SC" w:eastAsia="Songti SC"/>
+          <w:b/>
+          <w:color w:val="1F4E79"/>
+          <w:sz w:val="20"/>
+        </w:rPr>
+        <w:t>相关材料：</w:t>
+      </w:r>
+      <w:r>
+        <w:rPr>
+          <w:rFonts w:ascii="Songti SC" w:hAnsi="Songti SC" w:eastAsia="Songti SC"/>
+          <w:b w:val="0"/>
+          <w:sz w:val="20"/>
+        </w:rPr>
+        <w:t>打造中医药新时尚，把中医药传统理念与现代烘焙、消费需求结合</w:t>
+      </w:r>
+    </w:p>
+    <w:p>
+      <w:pPr>
+        <w:spacing w:after="40" w:line="259" w:lineRule="auto"/>
+        <w:ind w:left="312"/>
+      </w:pPr>
+      <w:r>
+        <w:rPr>
+          <w:rFonts w:ascii="Songti SC" w:hAnsi="Songti SC" w:eastAsia="Songti SC"/>
+          <w:b/>
+          <w:color w:val="1F4E79"/>
+          <w:sz w:val="20"/>
+        </w:rPr>
+        <w:t>触发知识：</w:t>
+      </w:r>
+      <w:r>
+        <w:rPr>
+          <w:rFonts w:ascii="Songti SC" w:hAnsi="Songti SC" w:eastAsia="Songti SC"/>
+          <w:b w:val="0"/>
+          <w:sz w:val="20"/>
+        </w:rPr>
+        <w:t>主观能动性 / 意识的能动作用</w:t>
+      </w:r>
+    </w:p>
+    <w:p>
+      <w:pPr>
+        <w:spacing w:after="40" w:line="259" w:lineRule="auto"/>
+        <w:ind w:left="312"/>
+      </w:pPr>
+      <w:r>
+        <w:rPr>
+          <w:rFonts w:ascii="Songti SC" w:hAnsi="Songti SC" w:eastAsia="Songti SC"/>
+          <w:b/>
+          <w:color w:val="1F4E79"/>
+          <w:sz w:val="20"/>
+        </w:rPr>
+        <w:t>为什么触发：</w:t>
+      </w:r>
+      <w:r>
+        <w:rPr>
+          <w:rFonts w:ascii="Songti SC" w:hAnsi="Songti SC" w:eastAsia="Songti SC"/>
+          <w:b w:val="0"/>
+          <w:sz w:val="20"/>
+        </w:rPr>
+        <w:t>触发点在把传统理念、现代产品、消费场景重新连接，在继承基础上创新表达</w:t>
+      </w:r>
+    </w:p>
+    <w:p>
+      <w:pPr>
+        <w:spacing w:after="40" w:line="259" w:lineRule="auto"/>
+        <w:ind w:left="312"/>
+      </w:pPr>
+      <w:r>
+        <w:rPr>
+          <w:rFonts w:ascii="Songti SC" w:hAnsi="Songti SC" w:eastAsia="Songti SC"/>
+          <w:b/>
+          <w:color w:val="1F4E79"/>
+          <w:sz w:val="20"/>
+        </w:rPr>
+        <w:t>来源与证据：</w:t>
+      </w:r>
+      <w:r>
+        <w:rPr>
+          <w:rFonts w:ascii="Songti SC" w:hAnsi="Songti SC" w:eastAsia="Songti SC"/>
+          <w:b w:val="0"/>
+          <w:sz w:val="20"/>
+        </w:rPr>
+        <w:t>2025北京海淀高三（上）期末 第16题；B评标/讲评角度清单；材料链为整理者解释</w:t>
+      </w:r>
+    </w:p>
+    <w:p>
+      <w:pPr>
+        <w:spacing w:before="100" w:after="40"/>
+      </w:pPr>
+      <w:r>
+        <w:rPr>
+          <w:rFonts w:ascii="Songti SC" w:hAnsi="Songti SC" w:eastAsia="Songti SC"/>
+          <w:b/>
+          <w:color w:val="1F4E79"/>
+          <w:sz w:val="21"/>
+        </w:rPr>
         <w:t>8. 真正触发点：</w:t>
       </w:r>
       <w:r>
@@ -3697,7 +3697,7 @@
           <w:b w:val="0"/>
           <w:sz w:val="21"/>
         </w:rPr>
-        <w:t>段意触发：整段突出人的认识、规划、选择或创造：打造中医药新时尚，把中医药传统理念与现代烘焙、消费需求结合</w:t>
+        <w:t>段意触发：整段突出人的认识、规划、选择或创造：老字号、医院、药房等主体围绕药食同源、中药元素、不同消费人群，主动设计石斛曲奇、养生面包、中药咖啡等新产品</w:t>
       </w:r>
     </w:p>
     <w:p>
@@ -3720,7 +3720,7 @@
           <w:b w:val="0"/>
           <w:sz w:val="20"/>
         </w:rPr>
-        <w:t>打造中医药新时尚，把中医药传统理念与现代烘焙、消费需求结合</w:t>
+        <w:t>老字号、医院、药房等主体围绕药食同源、中药元素、不同消费人群，主动设计石斛曲奇、养生面包、中药咖啡等新产品</w:t>
       </w:r>
     </w:p>
     <w:p>
@@ -3743,7 +3743,7 @@
           <w:b w:val="0"/>
           <w:sz w:val="20"/>
         </w:rPr>
-        <w:t>联系观点 / 发展观点 / 辩证否定 / 主观能动性</w:t>
+        <w:t>主观能动性 / 意识的能动作用</w:t>
       </w:r>
     </w:p>
     <w:p>
@@ -3766,7 +3766,7 @@
           <w:b w:val="0"/>
           <w:sz w:val="20"/>
         </w:rPr>
-        <w:t>触发点在把传统理念、现代产品、消费场景重新连接，在继承基础上创新表达</w:t>
+        <w:t>中医药资源不会自行变成“新时尚”，关键在主体对传统资源、现代消费和产品形式的主动选择、设计与转化；材料突出人的创意、组织和改造活动，因此可以可对应主观能动性</w:t>
       </w:r>
     </w:p>
     <w:p>
@@ -3789,7 +3789,7 @@
           <w:b w:val="0"/>
           <w:sz w:val="20"/>
         </w:rPr>
-        <w:t>2025北京海淀高三（上）期末 第16题；B评标/讲评角度清单；材料链为整理者解释</w:t>
+        <w:t>2025北京海淀高三（上）期末 第16题（用户确认PPT给分口径）；B评标/讲评角度清单；材料链为整理者解释</w:t>
       </w:r>
     </w:p>
     <w:p>
@@ -3811,7 +3811,7 @@
           <w:b w:val="0"/>
           <w:sz w:val="21"/>
         </w:rPr>
-        <w:t>段意触发：整段突出人的认识、规划、选择或创造：老字号、医院、药房等主体围绕药食同源、中药元素、不同消费人群，主动设计石斛曲奇、养生面包、中药咖啡等新产品</w:t>
+        <w:t>正确项：京西稻主题曲由AI编曲、AI演唱，但主题、场景和文化表达都服务于“科技与文化的和鸣”这一人的创作意图</w:t>
       </w:r>
     </w:p>
     <w:p>
@@ -3834,7 +3834,7 @@
           <w:b w:val="0"/>
           <w:sz w:val="20"/>
         </w:rPr>
-        <w:t>老字号、医院、药房等主体围绕药食同源、中药元素、不同消费人群，主动设计石斛曲奇、养生面包、中药咖啡等新产品</w:t>
+        <w:t>京西稻主题曲由AI编曲、AI演唱，但主题、场景和文化表达都服务于“科技与文化的和鸣”这一人的创作意图</w:t>
       </w:r>
     </w:p>
     <w:p>
@@ -3880,7 +3880,7 @@
           <w:b w:val="0"/>
           <w:sz w:val="20"/>
         </w:rPr>
-        <w:t>中医药资源不会自行变成“新时尚”，关键在主体对传统资源、现代消费和产品形式的主动选择、设计与转化；材料突出人的创意、组织和改造活动，因此可以可对应主观能动性</w:t>
+        <w:t>材料并没有把AI写成独立创作主体，而是把技术放进人的文化表达和主题建构之中；科技如何进入创作、服务什么主题、呈现何种文化效果，都取决于人的选择、设计和运用，所以可对应主观能动性</w:t>
       </w:r>
     </w:p>
     <w:p>
@@ -3903,7 +3903,7 @@
           <w:b w:val="0"/>
           <w:sz w:val="20"/>
         </w:rPr>
-        <w:t>2025北京海淀高三（上）期末 第16题（用户确认PPT给分口径）；B评标/讲评角度清单；材料链为整理者解释</w:t>
+        <w:t>2025北京海淀高三（上）期末 第4题；C选择题正确项；有可靠答案源</w:t>
       </w:r>
     </w:p>
     <w:p>
@@ -3925,7 +3925,7 @@
           <w:b w:val="0"/>
           <w:sz w:val="21"/>
         </w:rPr>
-        <w:t>正确项：京西稻主题曲由AI编曲、AI演唱，但主题、场景和文化表达都服务于“科技与文化的和鸣”这一人的创作意图</w:t>
+        <w:t>段意触发：整段突出人的认识、规划、选择或创造：门头沟建成算力中心、算法登记服务中心、数智人产业基地，持续培育人工智能、超高清数字视听、医疗器械等新产业</w:t>
       </w:r>
     </w:p>
     <w:p>
@@ -3948,7 +3948,7 @@
           <w:b w:val="0"/>
           <w:sz w:val="20"/>
         </w:rPr>
-        <w:t>京西稻主题曲由AI编曲、AI演唱，但主题、场景和文化表达都服务于“科技与文化的和鸣”这一人的创作意图</w:t>
+        <w:t>门头沟建成算力中心、算法登记服务中心、数智人产业基地，持续培育人工智能、超高清数字视听、医疗器械等新产业</w:t>
       </w:r>
     </w:p>
     <w:p>
@@ -3994,7 +3994,7 @@
           <w:b w:val="0"/>
           <w:sz w:val="20"/>
         </w:rPr>
-        <w:t>材料并没有把AI写成独立创作主体，而是把技术放进人的文化表达和主题建构之中；科技如何进入创作、服务什么主题、呈现何种文化效果，都取决于人的选择、设计和运用，所以可对应主观能动性</w:t>
+        <w:t>材料显示转型触发点在通过规划产业方向、搭建平台、引入创新中心和打造 IP，把对未来产业趋势的认识转化为现实建设行动，因此触发主观能动性</w:t>
       </w:r>
     </w:p>
     <w:p>
@@ -4017,7 +4017,7 @@
           <w:b w:val="0"/>
           <w:sz w:val="20"/>
         </w:rPr>
-        <w:t>2025北京海淀高三（上）期末 第4题；C选择题正确项；有可靠答案源</w:t>
+        <w:t>2025北京门头沟高三一模 第21题（2）；A细则/阅卷/评分标准直接支持</w:t>
       </w:r>
     </w:p>
     <w:p>
@@ -4039,7 +4039,7 @@
           <w:b w:val="0"/>
           <w:sz w:val="21"/>
         </w:rPr>
-        <w:t>段意触发：整段突出人的认识、规划、选择或创造：门头沟建成算力中心、算法登记服务中心、数智人产业基地，持续培育人工智能、超高清数字视听、医疗器械等新产业</w:t>
+        <w:t>正确项：发挥主观能动性、在个人与社会统一中创造价值</w:t>
       </w:r>
     </w:p>
     <w:p>
@@ -4062,7 +4062,7 @@
           <w:b w:val="0"/>
           <w:sz w:val="20"/>
         </w:rPr>
-        <w:t>门头沟建成算力中心、算法登记服务中心、数智人产业基地，持续培育人工智能、超高清数字视听、医疗器械等新产业</w:t>
+        <w:t>黄旭华把个人理想融入国家安全，带领团队攻克核潜艇关键技术，并以事迹激励更多人投身国家建设</w:t>
       </w:r>
     </w:p>
     <w:p>
@@ -4085,7 +4085,7 @@
           <w:b w:val="0"/>
           <w:sz w:val="20"/>
         </w:rPr>
-        <w:t>主观能动性 / 意识的能动作用 / 创新驱动发展</w:t>
+        <w:t>主观能动性 / 意识的能动作用</w:t>
       </w:r>
     </w:p>
     <w:p>
@@ -4108,7 +4108,7 @@
           <w:b w:val="0"/>
           <w:sz w:val="20"/>
         </w:rPr>
-        <w:t>材料显示转型触发点在通过规划产业方向、搭建平台、引入创新中心和打造 IP，把对未来产业趋势的认识转化为现实建设行动，因此触发主观能动性</w:t>
+        <w:t>材料的重心触发点在个人理想、国家需要、团队攻关和民族复兴目标相统一；正确项强调发挥主观能动性、在个人与社会统一中创造价值，说明人生价值要在服务国家和人民的实践中实现</w:t>
       </w:r>
     </w:p>
     <w:p>
@@ -4131,7 +4131,7 @@
           <w:b w:val="0"/>
           <w:sz w:val="20"/>
         </w:rPr>
-        <w:t>2025北京门头沟高三一模 第21题（2）；A细则/阅卷/评分标准直接支持</w:t>
+        <w:t>2025北京门头沟高三一模 第7题；C选择题正确项；有可靠答案源</w:t>
       </w:r>
     </w:p>
     <w:p>
@@ -4153,7 +4153,7 @@
           <w:b w:val="0"/>
           <w:sz w:val="21"/>
         </w:rPr>
-        <w:t>正确项：发挥主观能动性、在个人与社会统一中创造价值</w:t>
+        <w:t>段意触发：整段突出人的认识、规划、选择或创造：从1953年至今，五年规划一以贯之服务社会主义现代化建设</w:t>
       </w:r>
     </w:p>
     <w:p>
@@ -4176,7 +4176,7 @@
           <w:b w:val="0"/>
           <w:sz w:val="20"/>
         </w:rPr>
-        <w:t>黄旭华把个人理想融入国家安全，带领团队攻克核潜艇关键技术，并以事迹激励更多人投身国家建设</w:t>
+        <w:t>从1953年至今，五年规划一以贯之服务社会主义现代化建设；前十四个五年规划延续至今，主题始终指向现代化</w:t>
       </w:r>
     </w:p>
     <w:p>
@@ -4199,7 +4199,7 @@
           <w:b w:val="0"/>
           <w:sz w:val="20"/>
         </w:rPr>
-        <w:t>实现人生价值 / 主观能动性 / 个人与社会统一</w:t>
+        <w:t>主观能动性 / 意识的能动作用</w:t>
       </w:r>
     </w:p>
     <w:p>
@@ -4222,7 +4222,7 @@
           <w:b w:val="0"/>
           <w:sz w:val="20"/>
         </w:rPr>
-        <w:t>材料的重心触发点在个人理想、国家需要、团队攻关和民族复兴目标相统一；正确项强调发挥主观能动性、在个人与社会统一中创造价值，说明人生价值要在服务国家和人民的实践中实现</w:t>
+        <w:t>评标把“正确认识、遵循规律”等作为可用知识；五年规划触发点在认识发展阶段、经济社会规律和现代化目标基础上的持续谋划</w:t>
       </w:r>
     </w:p>
     <w:p>
@@ -4245,7 +4245,7 @@
           <w:b w:val="0"/>
           <w:sz w:val="20"/>
         </w:rPr>
-        <w:t>2025北京门头沟高三一模 第7题；C选择题正确项；有可靠答案源</w:t>
+        <w:t>2026北京丰台高三（上）期末 第22题；B评标/讲评角度清单；材料链为整理者解释</w:t>
       </w:r>
     </w:p>
     <w:p>
@@ -4267,7 +4267,7 @@
           <w:b w:val="0"/>
           <w:sz w:val="21"/>
         </w:rPr>
-        <w:t>段意触发：整段突出人的认识、规划、选择或创造：从1953年至今，五年规划一以贯之服务社会主义现代化建设</w:t>
+        <w:t>段意触发：整段突出人的认识、规划、选择或创造：复制粘贴取代独立探索，网络用语泛化导致书面表达能力弱化，技术便利可能带来思维惰化</w:t>
       </w:r>
     </w:p>
     <w:p>
@@ -4290,7 +4290,7 @@
           <w:b w:val="0"/>
           <w:sz w:val="20"/>
         </w:rPr>
-        <w:t>从1953年至今，五年规划一以贯之服务社会主义现代化建设；前十四个五年规划延续至今，主题始终指向现代化</w:t>
+        <w:t>复制粘贴取代独立探索，网络用语泛化导致书面表达能力弱化，技术便利可能带来思维惰化</w:t>
       </w:r>
     </w:p>
     <w:p>
@@ -4313,7 +4313,7 @@
           <w:b w:val="0"/>
           <w:sz w:val="20"/>
         </w:rPr>
-        <w:t>发展观点 / 规律客观性与主观能动性</w:t>
+        <w:t>主观能动性 / 意识的能动作用</w:t>
       </w:r>
     </w:p>
     <w:p>
@@ -4336,7 +4336,7 @@
           <w:b w:val="0"/>
           <w:sz w:val="20"/>
         </w:rPr>
-        <w:t>评标把“正确认识、遵循规律”等作为可用知识；五年规划触发点在在认识发展阶段、经济社会规律和现代化目标基础上的持续谋划</w:t>
+        <w:t>触发点在追问“数字原住民”如何面对技术环境；独立思考、表达训练、判断能力都需要主体主动培养</w:t>
       </w:r>
     </w:p>
     <w:p>
@@ -4359,7 +4359,7 @@
           <w:b w:val="0"/>
           <w:sz w:val="20"/>
         </w:rPr>
-        <w:t>2026北京丰台高三（上）期末 第22题；B评标/讲评角度清单；材料链为整理者解释</w:t>
+        <w:t>2026北京海淀高三（上）期末 第16题（评分标准）；A细则/阅卷/评分标准直接支持</w:t>
       </w:r>
     </w:p>
     <w:p>
@@ -4381,7 +4381,7 @@
           <w:b w:val="0"/>
           <w:sz w:val="21"/>
         </w:rPr>
-        <w:t>段意触发：整段突出人的认识、规划、选择或创造：复制粘贴取代独立探索，网络用语泛化导致书面表达能力弱化，技术便利可能带来思维惰化</w:t>
+        <w:t>正确项：AI写作可以提供素材和思路，但也会表述机械、缺乏原创性；真正高质量写作仍要靠创作者独立思考和创造</w:t>
       </w:r>
     </w:p>
     <w:p>
@@ -4404,7 +4404,7 @@
           <w:b w:val="0"/>
           <w:sz w:val="20"/>
         </w:rPr>
-        <w:t>复制粘贴取代独立探索，网络用语泛化导致书面表达能力弱化，技术便利可能带来思维惰化</w:t>
+        <w:t>AI写作可以提供素材和思路，但也会表述机械、缺乏原创性；真正高质量写作仍要靠创作者独立思考和创造</w:t>
       </w:r>
     </w:p>
     <w:p>
@@ -4427,7 +4427,7 @@
           <w:b w:val="0"/>
           <w:sz w:val="20"/>
         </w:rPr>
-        <w:t>意识的能动作用 / 主观能动性</w:t>
+        <w:t>主观能动性 / 意识的能动作用</w:t>
       </w:r>
     </w:p>
     <w:p>
@@ -4450,7 +4450,7 @@
           <w:b w:val="0"/>
           <w:sz w:val="20"/>
         </w:rPr>
-        <w:t>触发点在追问“数字原住民”如何面对技术环境；独立思考、表达训练、判断能力都需要主体主动培养</w:t>
+        <w:t>材料一方面承认AI的效率优势，另一方面明确其不能替代人的特有感知和原创判断；写作不是简单拼装信息，而要靠主体主动选择、加工和表达，所以可对应意识能动作用</w:t>
       </w:r>
     </w:p>
     <w:p>
@@ -4473,7 +4473,7 @@
           <w:b w:val="0"/>
           <w:sz w:val="20"/>
         </w:rPr>
-        <w:t>2026北京海淀高三（上）期末 第16题（评分标准）；A细则/阅卷/评分标准直接支持</w:t>
+        <w:t>2026北京石景山高三一模 第3题；C选择题正确项；有可靠答案源</w:t>
       </w:r>
     </w:p>
     <w:p>
@@ -4488,120 +4488,6 @@
           <w:sz w:val="21"/>
         </w:rPr>
         <w:t>15. 真正触发点：</w:t>
-      </w:r>
-      <w:r>
-        <w:rPr>
-          <w:rFonts w:ascii="Songti SC" w:hAnsi="Songti SC" w:eastAsia="Songti SC"/>
-          <w:b w:val="0"/>
-          <w:sz w:val="21"/>
-        </w:rPr>
-        <w:t>正确项：AI写作可以提供素材和思路，但也会表述机械、缺乏原创性；真正高质量写作仍要靠创作者独立思考和创造</w:t>
-      </w:r>
-    </w:p>
-    <w:p>
-      <w:pPr>
-        <w:spacing w:after="40" w:line="259" w:lineRule="auto"/>
-        <w:ind w:left="312"/>
-      </w:pPr>
-      <w:r>
-        <w:rPr>
-          <w:rFonts w:ascii="Songti SC" w:hAnsi="Songti SC" w:eastAsia="Songti SC"/>
-          <w:b/>
-          <w:color w:val="1F4E79"/>
-          <w:sz w:val="20"/>
-        </w:rPr>
-        <w:t>相关材料：</w:t>
-      </w:r>
-      <w:r>
-        <w:rPr>
-          <w:rFonts w:ascii="Songti SC" w:hAnsi="Songti SC" w:eastAsia="Songti SC"/>
-          <w:b w:val="0"/>
-          <w:sz w:val="20"/>
-        </w:rPr>
-        <w:t>AI写作可以提供素材和思路，但也会表述机械、缺乏原创性；真正高质量写作仍要靠创作者独立思考和创造</w:t>
-      </w:r>
-    </w:p>
-    <w:p>
-      <w:pPr>
-        <w:spacing w:after="40" w:line="259" w:lineRule="auto"/>
-        <w:ind w:left="312"/>
-      </w:pPr>
-      <w:r>
-        <w:rPr>
-          <w:rFonts w:ascii="Songti SC" w:hAnsi="Songti SC" w:eastAsia="Songti SC"/>
-          <w:b/>
-          <w:color w:val="1F4E79"/>
-          <w:sz w:val="20"/>
-        </w:rPr>
-        <w:t>触发知识：</w:t>
-      </w:r>
-      <w:r>
-        <w:rPr>
-          <w:rFonts w:ascii="Songti SC" w:hAnsi="Songti SC" w:eastAsia="Songti SC"/>
-          <w:b w:val="0"/>
-          <w:sz w:val="20"/>
-        </w:rPr>
-        <w:t>主观能动性 / 意识的能动作用</w:t>
-      </w:r>
-    </w:p>
-    <w:p>
-      <w:pPr>
-        <w:spacing w:after="40" w:line="259" w:lineRule="auto"/>
-        <w:ind w:left="312"/>
-      </w:pPr>
-      <w:r>
-        <w:rPr>
-          <w:rFonts w:ascii="Songti SC" w:hAnsi="Songti SC" w:eastAsia="Songti SC"/>
-          <w:b/>
-          <w:color w:val="1F4E79"/>
-          <w:sz w:val="20"/>
-        </w:rPr>
-        <w:t>为什么触发：</w:t>
-      </w:r>
-      <w:r>
-        <w:rPr>
-          <w:rFonts w:ascii="Songti SC" w:hAnsi="Songti SC" w:eastAsia="Songti SC"/>
-          <w:b w:val="0"/>
-          <w:sz w:val="20"/>
-        </w:rPr>
-        <w:t>材料一方面承认AI的效率优势，另一方面明确其不能替代人的特有感知和原创判断；写作不是简单拼装信息，而要靠主体主动选择、加工和表达，所以可对应意识能动作用</w:t>
-      </w:r>
-    </w:p>
-    <w:p>
-      <w:pPr>
-        <w:spacing w:after="40" w:line="259" w:lineRule="auto"/>
-        <w:ind w:left="312"/>
-      </w:pPr>
-      <w:r>
-        <w:rPr>
-          <w:rFonts w:ascii="Songti SC" w:hAnsi="Songti SC" w:eastAsia="Songti SC"/>
-          <w:b/>
-          <w:color w:val="1F4E79"/>
-          <w:sz w:val="20"/>
-        </w:rPr>
-        <w:t>来源与证据：</w:t>
-      </w:r>
-      <w:r>
-        <w:rPr>
-          <w:rFonts w:ascii="Songti SC" w:hAnsi="Songti SC" w:eastAsia="Songti SC"/>
-          <w:b w:val="0"/>
-          <w:sz w:val="20"/>
-        </w:rPr>
-        <w:t>2026北京石景山高三一模 第3题；C选择题正确项；有可靠答案源</w:t>
-      </w:r>
-    </w:p>
-    <w:p>
-      <w:pPr>
-        <w:spacing w:before="100" w:after="40"/>
-      </w:pPr>
-      <w:r>
-        <w:rPr>
-          <w:rFonts w:ascii="Songti SC" w:hAnsi="Songti SC" w:eastAsia="Songti SC"/>
-          <w:b/>
-          <w:color w:val="1F4E79"/>
-          <w:sz w:val="21"/>
-        </w:rPr>
-        <w:t>16. 真正触发点：</w:t>
       </w:r>
       <w:r>
         <w:rPr>
@@ -4801,7 +4687,7 @@
           <w:b w:val="0"/>
           <w:sz w:val="20"/>
         </w:rPr>
-        <w:t>细则把“尊重规律”放在哲学层面第一项；桑基鱼塘触发点在在顺应水、桑、蚕、鱼、塘之间生态规律的基础上形成</w:t>
+        <w:t>细则把“尊重规律”放在哲学层面第一项；桑基鱼塘触发点在顺应水、桑、蚕、鱼、塘之间生态规律的基础上形成</w:t>
       </w:r>
     </w:p>
     <w:p>
@@ -4926,7 +4812,7 @@
           <w:b w:val="0"/>
           <w:sz w:val="20"/>
         </w:rPr>
-        <w:t>实践观点 / 发展观点 / 联系观点 / 物质与意识辩证关系 / 尊重规律与发挥主观能动性</w:t>
+        <w:t>尊重客观规律与发挥主观能动性相结合</w:t>
       </w:r>
     </w:p>
     <w:p>
@@ -5587,7 +5473,7 @@
           <w:b w:val="0"/>
           <w:sz w:val="20"/>
         </w:rPr>
-        <w:t>材料既写到再生水、雨洪蓄滞、屋顶荷载等客观工程和生态条件，也写到人工设计把这些条件转化为复合功能空间；正确项中的“尊重自然规律，实现生态环境与基础设施和谐统一”说明人触发点在在把握客观联系基础上主动优化人为联系</w:t>
+        <w:t>材料既写到再生水、雨洪蓄滞、屋顶荷载等客观工程和生态条件，也写到人工设计把这些条件转化为复合功能空间；正确项中的“尊重自然规律，实现生态环境与基础设施和谐统一”说明人触发点在把握客观联系基础上主动优化人为联系</w:t>
       </w:r>
     </w:p>
     <w:p>
@@ -5929,7 +5815,7 @@
           <w:b w:val="0"/>
           <w:sz w:val="20"/>
         </w:rPr>
-        <w:t>答案细则把“把发挥主观能动性与尊重客观规律相结合”列为第16（1）问示例角度；废弃水井改造触发点在在把握生态规律、动物需求和场地条件后主动创造条件，因此应补入尊重规律与能动性栏目</w:t>
+        <w:t>答案细则把“把发挥主观能动性与尊重客观规律相结合”列为第16（1）问示例角度；废弃水井改造触发点在把握生态规律、动物需求和场地条件后主动创造条件，因此应补入尊重规律与能动性栏目</w:t>
       </w:r>
     </w:p>
     <w:p>
@@ -6037,7 +5923,7 @@
           <w:b w:val="0"/>
           <w:sz w:val="20"/>
         </w:rPr>
-        <w:t>尊重客观规律与发挥主观能动性 / 科学思维客观性和预见性</w:t>
+        <w:t>尊重客观规律与发挥主观能动性相结合</w:t>
       </w:r>
     </w:p>
     <w:p>
@@ -6288,7 +6174,7 @@
           <w:b w:val="0"/>
           <w:sz w:val="20"/>
         </w:rPr>
-        <w:t>评标明确给出该角度；留白触发点在在把握对象自身规律、环境条件和人的审美需求后主动设计</w:t>
+        <w:t>评标明确给出该角度；留白触发点在把握对象自身规律、环境条件和人的审美需求后主动设计</w:t>
       </w:r>
     </w:p>
     <w:p>
@@ -6853,7 +6739,7 @@
           <w:b w:val="0"/>
           <w:sz w:val="20"/>
         </w:rPr>
-        <w:t>联系的观点 / 整体与部分 / 系统优化</w:t>
+        <w:t>联系的普遍性 / 联系的观点（总）</w:t>
       </w:r>
     </w:p>
     <w:p>
@@ -6967,7 +6853,7 @@
           <w:b w:val="0"/>
           <w:sz w:val="20"/>
         </w:rPr>
-        <w:t>联系观点 / 文化交流互鉴 / 全人类共同价值</w:t>
+        <w:t>联系的普遍性 / 联系的观点（总）</w:t>
       </w:r>
     </w:p>
     <w:p>
@@ -7081,7 +6967,7 @@
           <w:b w:val="0"/>
           <w:sz w:val="20"/>
         </w:rPr>
-        <w:t>联系的观点 / 系统观念</w:t>
+        <w:t>联系的普遍性 / 联系的观点（总）</w:t>
       </w:r>
     </w:p>
     <w:p>
@@ -7195,7 +7081,7 @@
           <w:b w:val="0"/>
           <w:sz w:val="20"/>
         </w:rPr>
-        <w:t>整体与部分 / 个人与国家的联系</w:t>
+        <w:t>联系的普遍性 / 联系的观点（总）</w:t>
       </w:r>
     </w:p>
     <w:p>
@@ -7309,7 +7195,7 @@
           <w:b w:val="0"/>
           <w:sz w:val="20"/>
         </w:rPr>
-        <w:t>联系观点 / 文化交流互鉴 / 人类命运共同体</w:t>
+        <w:t>联系的普遍性 / 联系的观点（总）</w:t>
       </w:r>
     </w:p>
     <w:p>
@@ -7423,7 +7309,7 @@
           <w:b w:val="0"/>
           <w:sz w:val="20"/>
         </w:rPr>
-        <w:t>联系的观点 / 整体与部分 / 系统优化</w:t>
+        <w:t>联系的普遍性 / 联系的观点（总）</w:t>
       </w:r>
     </w:p>
     <w:p>
@@ -7537,7 +7423,7 @@
           <w:b w:val="0"/>
           <w:sz w:val="20"/>
         </w:rPr>
-        <w:t>联系的观点 / 文化连续性</w:t>
+        <w:t>联系的普遍性 / 联系的观点（总）</w:t>
       </w:r>
     </w:p>
     <w:p>
@@ -7651,7 +7537,7 @@
           <w:b w:val="0"/>
           <w:sz w:val="20"/>
         </w:rPr>
-        <w:t>整体与部分 / 系统观念</w:t>
+        <w:t>联系的普遍性 / 联系的观点（总）</w:t>
       </w:r>
     </w:p>
     <w:p>
@@ -7765,7 +7651,7 @@
           <w:b w:val="0"/>
           <w:sz w:val="20"/>
         </w:rPr>
-        <w:t>整体与部分 / 系统观念</w:t>
+        <w:t>联系的普遍性 / 联系的观点（总）</w:t>
       </w:r>
     </w:p>
     <w:p>
@@ -7879,7 +7765,7 @@
           <w:b w:val="0"/>
           <w:sz w:val="20"/>
         </w:rPr>
-        <w:t>整体与部分 / 系统观念</w:t>
+        <w:t>联系的普遍性 / 联系的观点（总）</w:t>
       </w:r>
     </w:p>
     <w:p>
@@ -7993,7 +7879,7 @@
           <w:b w:val="0"/>
           <w:sz w:val="20"/>
         </w:rPr>
-        <w:t>整体与部分 / 系统观念</w:t>
+        <w:t>联系的普遍性 / 联系的观点（总）</w:t>
       </w:r>
     </w:p>
     <w:p>
@@ -8107,7 +7993,7 @@
           <w:b w:val="0"/>
           <w:sz w:val="20"/>
         </w:rPr>
-        <w:t>联系的观点 / 整体与部分 / 系统优化</w:t>
+        <w:t>联系的普遍性 / 联系的观点（总）</w:t>
       </w:r>
     </w:p>
     <w:p>
@@ -8335,7 +8221,7 @@
           <w:b w:val="0"/>
           <w:sz w:val="20"/>
         </w:rPr>
-        <w:t>联系观点 / 文化与科技融合</w:t>
+        <w:t>联系的普遍性 / 联系的观点（总）</w:t>
       </w:r>
     </w:p>
     <w:p>
@@ -8449,7 +8335,7 @@
           <w:b w:val="0"/>
           <w:sz w:val="20"/>
         </w:rPr>
-        <w:t>联系观点 / 文化交流互鉴 / 共同发展</w:t>
+        <w:t>联系的普遍性 / 联系的观点（总）</w:t>
       </w:r>
     </w:p>
     <w:p>
@@ -8677,7 +8563,7 @@
           <w:b w:val="0"/>
           <w:sz w:val="20"/>
         </w:rPr>
-        <w:t>联系的客观性 / 自在联系</w:t>
+        <w:t>联系的普遍性 / 联系的观点（总）</w:t>
       </w:r>
     </w:p>
     <w:p>
@@ -9279,7 +9165,7 @@
           <w:b w:val="0"/>
           <w:sz w:val="20"/>
         </w:rPr>
-        <w:t>题干并列展示无人机、5G、自动驾驶等不同技术在农业不同环节发挥作用；命题重点在于说明农业现代化并触发点在在多种条件、多种技术路径、多种功能联动中实现的，所以可对应联系多样性</w:t>
+        <w:t>题干并列展示无人机、5G、自动驾驶等不同技术在农业不同环节发挥作用；命题重点在于说明农业现代化并触发点在多种条件、多种技术路径、多种功能联动中实现的，所以可对应联系多样性</w:t>
       </w:r>
     </w:p>
     <w:p>
@@ -9607,7 +9493,7 @@
           <w:b w:val="0"/>
           <w:sz w:val="20"/>
         </w:rPr>
-        <w:t>生产力观点 / 科技创新 / 系统观念</w:t>
+        <w:t>整体与部分 / 系统观念</w:t>
       </w:r>
     </w:p>
     <w:p>
@@ -9721,7 +9607,7 @@
           <w:b w:val="0"/>
           <w:sz w:val="20"/>
         </w:rPr>
-        <w:t>联系观点 / 系统观念 / 整体与部分</w:t>
+        <w:t>整体与部分 / 系统观念</w:t>
       </w:r>
     </w:p>
     <w:p>
@@ -9835,7 +9721,7 @@
           <w:b w:val="0"/>
           <w:sz w:val="20"/>
         </w:rPr>
-        <w:t>联系的观点 / 整体与部分 / 系统优化</w:t>
+        <w:t>整体与部分 / 系统观念</w:t>
       </w:r>
     </w:p>
     <w:p>
@@ -9983,7 +9869,7 @@
           <w:b w:val="0"/>
           <w:sz w:val="20"/>
         </w:rPr>
-        <w:t>联系观点 / 系统观念 / 整体优化</w:t>
+        <w:t>整体与部分 / 系统观念</w:t>
       </w:r>
     </w:p>
     <w:p>
@@ -10097,7 +9983,7 @@
           <w:b w:val="0"/>
           <w:sz w:val="20"/>
         </w:rPr>
-        <w:t>整体与部分 / 系统观念 / 实践路径</w:t>
+        <w:t>整体与部分 / 系统观念</w:t>
       </w:r>
     </w:p>
     <w:p>
@@ -10211,7 +10097,7 @@
           <w:b w:val="0"/>
           <w:sz w:val="20"/>
         </w:rPr>
-        <w:t>联系的观点 / 系统观念</w:t>
+        <w:t>整体与部分 / 系统观念</w:t>
       </w:r>
     </w:p>
     <w:p>
@@ -10342,7 +10228,7 @@
           <w:b w:val="0"/>
           <w:sz w:val="20"/>
         </w:rPr>
-        <w:t>整体与部分 / 个人与国家的联系</w:t>
+        <w:t>整体与部分 / 系统观念</w:t>
       </w:r>
     </w:p>
     <w:p>
@@ -10473,7 +10359,7 @@
           <w:b w:val="0"/>
           <w:sz w:val="20"/>
         </w:rPr>
-        <w:t>系统观念 / 整体与部分</w:t>
+        <w:t>整体与部分 / 系统观念</w:t>
       </w:r>
     </w:p>
     <w:p>
@@ -10587,7 +10473,7 @@
           <w:b w:val="0"/>
           <w:sz w:val="20"/>
         </w:rPr>
-        <w:t>系统观念 / 实践观点 / 政治参与</w:t>
+        <w:t>整体与部分 / 系统观念</w:t>
       </w:r>
     </w:p>
     <w:p>
@@ -10701,7 +10587,7 @@
           <w:b w:val="0"/>
           <w:sz w:val="20"/>
         </w:rPr>
-        <w:t>联系观点 / 整体与部分 / 系统观念</w:t>
+        <w:t>整体与部分 / 系统观念</w:t>
       </w:r>
     </w:p>
     <w:p>
@@ -10815,7 +10701,7 @@
           <w:b w:val="0"/>
           <w:sz w:val="20"/>
         </w:rPr>
-        <w:t>联系观点 / 系统优化方法 / 创新意识</w:t>
+        <w:t>整体与部分 / 系统观念</w:t>
       </w:r>
     </w:p>
     <w:p>
@@ -10929,7 +10815,7 @@
           <w:b w:val="0"/>
           <w:sz w:val="20"/>
         </w:rPr>
-        <w:t>联系观点 / 文化传承 / 系统观念</w:t>
+        <w:t>整体与部分 / 系统观念</w:t>
       </w:r>
     </w:p>
     <w:p>
@@ -11043,7 +10929,7 @@
           <w:b w:val="0"/>
           <w:sz w:val="20"/>
         </w:rPr>
-        <w:t>系统观念 / 文化自信 / 创新意识</w:t>
+        <w:t>整体与部分 / 系统观念</w:t>
       </w:r>
     </w:p>
     <w:p>
@@ -11157,7 +11043,7 @@
           <w:b w:val="0"/>
           <w:sz w:val="20"/>
         </w:rPr>
-        <w:t>联系的观点 / 整体与部分 / 系统优化</w:t>
+        <w:t>整体与部分 / 系统观念</w:t>
       </w:r>
     </w:p>
     <w:p>
@@ -11288,7 +11174,7 @@
           <w:b w:val="0"/>
           <w:sz w:val="20"/>
         </w:rPr>
-        <w:t>中华民族共同体意识 / 文化多样性 / 中华文化整体性</w:t>
+        <w:t>整体与部分 / 系统观念</w:t>
       </w:r>
     </w:p>
     <w:p>
@@ -11533,7 +11419,7 @@
           <w:b w:val="0"/>
           <w:sz w:val="20"/>
         </w:rPr>
-        <w:t>整体与部分 / 系统观念 / 统筹兼顾</w:t>
+        <w:t>整体与部分 / 系统观念</w:t>
       </w:r>
     </w:p>
     <w:p>
@@ -11875,7 +11761,7 @@
           <w:b w:val="0"/>
           <w:sz w:val="20"/>
         </w:rPr>
-        <w:t>整体与部分 / 系统观念 / 联系观点</w:t>
+        <w:t>整体与部分 / 系统观念</w:t>
       </w:r>
     </w:p>
     <w:p>
@@ -11989,7 +11875,7 @@
           <w:b w:val="0"/>
           <w:sz w:val="20"/>
         </w:rPr>
-        <w:t>联系的观点 / 整体与部分 / 系统优化</w:t>
+        <w:t>整体与部分 / 系统观念</w:t>
       </w:r>
     </w:p>
     <w:p>
@@ -12103,7 +11989,7 @@
           <w:b w:val="0"/>
           <w:sz w:val="20"/>
         </w:rPr>
-        <w:t>联系的观点 / 系统观念 / 多主体协同</w:t>
+        <w:t>整体与部分 / 系统观念</w:t>
       </w:r>
     </w:p>
     <w:p>
@@ -12217,7 +12103,7 @@
           <w:b w:val="0"/>
           <w:sz w:val="20"/>
         </w:rPr>
-        <w:t>联系的观点 / 整体与部分 / 系统优化</w:t>
+        <w:t>整体与部分 / 系统观念</w:t>
       </w:r>
     </w:p>
     <w:p>
@@ -12348,7 +12234,7 @@
           <w:b w:val="0"/>
           <w:sz w:val="20"/>
         </w:rPr>
-        <w:t>联系观点 / 系统观念</w:t>
+        <w:t>整体与部分 / 系统观念</w:t>
       </w:r>
     </w:p>
     <w:p>
@@ -12462,7 +12348,7 @@
           <w:b w:val="0"/>
           <w:sz w:val="20"/>
         </w:rPr>
-        <w:t>联系观点 / 整体与部分 / 系统观念</w:t>
+        <w:t>整体与部分 / 系统观念</w:t>
       </w:r>
     </w:p>
     <w:p>
@@ -12576,7 +12462,7 @@
           <w:b w:val="0"/>
           <w:sz w:val="20"/>
         </w:rPr>
-        <w:t>联系观点 / 整体与部分 / 系统观念</w:t>
+        <w:t>整体与部分 / 系统观念</w:t>
       </w:r>
     </w:p>
     <w:p>
@@ -12690,7 +12576,7 @@
           <w:b w:val="0"/>
           <w:sz w:val="20"/>
         </w:rPr>
-        <w:t>联系观点 / 系统观念 / 人民群众</w:t>
+        <w:t>整体与部分 / 系统观念</w:t>
       </w:r>
     </w:p>
     <w:p>
@@ -12804,7 +12690,7 @@
           <w:b w:val="0"/>
           <w:sz w:val="20"/>
         </w:rPr>
-        <w:t>联系观点 / 整体与部分 / 系统优化</w:t>
+        <w:t>整体与部分 / 系统观念</w:t>
       </w:r>
     </w:p>
     <w:p>
@@ -12918,7 +12804,7 @@
           <w:b w:val="0"/>
           <w:sz w:val="20"/>
         </w:rPr>
-        <w:t>分析与综合 / 整体性思维</w:t>
+        <w:t>整体与部分 / 系统观念</w:t>
       </w:r>
     </w:p>
     <w:p>
@@ -13032,7 +12918,7 @@
           <w:b w:val="0"/>
           <w:sz w:val="20"/>
         </w:rPr>
-        <w:t>联系观点 / 整体与部分 / 系统观念</w:t>
+        <w:t>整体与部分 / 系统观念</w:t>
       </w:r>
     </w:p>
     <w:p>
@@ -13146,7 +13032,7 @@
           <w:b w:val="0"/>
           <w:sz w:val="20"/>
         </w:rPr>
-        <w:t>群众观点 / 系统观念 / 辩证思维</w:t>
+        <w:t>整体与部分 / 系统观念</w:t>
       </w:r>
     </w:p>
     <w:p>
@@ -13260,7 +13146,7 @@
           <w:b w:val="0"/>
           <w:sz w:val="20"/>
         </w:rPr>
-        <w:t>系统观念 / 联系观点 / 数字化治理</w:t>
+        <w:t>整体与部分 / 系统观念</w:t>
       </w:r>
     </w:p>
     <w:p>
@@ -13374,7 +13260,7 @@
           <w:b w:val="0"/>
           <w:sz w:val="20"/>
         </w:rPr>
-        <w:t>联系观点 / 系统优化</w:t>
+        <w:t>整体与部分 / 系统观念</w:t>
       </w:r>
     </w:p>
     <w:p>
@@ -13488,7 +13374,7 @@
           <w:b w:val="0"/>
           <w:sz w:val="20"/>
         </w:rPr>
-        <w:t>整体与部分 / 系统优化</w:t>
+        <w:t>整体与部分 / 系统观念</w:t>
       </w:r>
     </w:p>
     <w:p>
@@ -13759,7 +13645,7 @@
           <w:b w:val="0"/>
           <w:sz w:val="20"/>
         </w:rPr>
-        <w:t>辩证否定 / 守正创新</w:t>
+        <w:t>发展的观点 / 发展的普遍性</w:t>
       </w:r>
     </w:p>
     <w:p>
@@ -13782,7 +13668,7 @@
           <w:b w:val="0"/>
           <w:sz w:val="20"/>
         </w:rPr>
-        <w:t>阅卷细则在辩证法层面列出“辩证否定等”；桑基鱼塘“未老”的原因触发点在在保留生态循环和农业智慧的基础上更新功能形态，实现传统农业资源的创造性利用，因此可稳定补入辩证否定栏目</w:t>
+        <w:t>阅卷细则在辩证法层面列出“辩证否定等”；桑基鱼塘“未老”的原因触发点在保留生态循环和农业智慧的基础上更新功能形态，实现传统农业资源的创造性利用，因此可稳定补入辩证否定栏目</w:t>
       </w:r>
     </w:p>
     <w:p>
@@ -13873,7 +13759,7 @@
           <w:b w:val="0"/>
           <w:sz w:val="20"/>
         </w:rPr>
-        <w:t>人与自然和谐共生 / 共同富裕 / 和平发展</w:t>
+        <w:t>发展的观点 / 发展的普遍性</w:t>
       </w:r>
     </w:p>
     <w:p>
@@ -13987,7 +13873,7 @@
           <w:b w:val="0"/>
           <w:sz w:val="20"/>
         </w:rPr>
-        <w:t>发展观点 / 中华优秀传统文化 / 中国式现代化</w:t>
+        <w:t>发展的观点 / 发展的普遍性</w:t>
       </w:r>
     </w:p>
     <w:p>
@@ -14101,7 +13987,7 @@
           <w:b w:val="0"/>
           <w:sz w:val="20"/>
         </w:rPr>
-        <w:t>辩证否定 / 守正创新</w:t>
+        <w:t>发展的观点 / 发展的普遍性</w:t>
       </w:r>
     </w:p>
     <w:p>
@@ -14124,7 +14010,7 @@
           <w:b w:val="0"/>
           <w:sz w:val="20"/>
         </w:rPr>
-        <w:t>评标明确把“坚持辩证否定观”列入第17题可得2分的哲学角度；题目触发点在在继承农耕文明合理内核的基础上克服不合时宜的呈现方式，形成面向新时代的创造性转化</w:t>
+        <w:t>评标明确把“坚持辩证否定观”列入第17题可得2分的哲学角度；题目触发点在继承农耕文明合理内核的基础上克服不合时宜的呈现方式，形成面向新时代的创造性转化</w:t>
       </w:r>
     </w:p>
     <w:p>
@@ -14215,7 +14101,7 @@
           <w:b w:val="0"/>
           <w:sz w:val="20"/>
         </w:rPr>
-        <w:t>实践具有历史性 / 科技创新推动生产力发展</w:t>
+        <w:t>发展的观点 / 发展的普遍性</w:t>
       </w:r>
     </w:p>
     <w:p>
@@ -14352,7 +14238,7 @@
           <w:b w:val="0"/>
           <w:sz w:val="20"/>
         </w:rPr>
-        <w:t>触发点在在保留春节团圆、祈愿、喜庆等精神核心的同时，把现代科技、现代休闲方式融入其中，使传统节日获得新形式和新内涵；这正体现了在继承基础上的扬弃和发展</w:t>
+        <w:t>触发点在保留春节团圆、祈愿、喜庆等精神核心的同时，把现代科技、现代休闲方式融入其中，使传统节日获得新形式和新内涵；这正体现了在继承基础上的扬弃和发展</w:t>
       </w:r>
     </w:p>
     <w:p>
@@ -14466,7 +14352,7 @@
           <w:b w:val="0"/>
           <w:sz w:val="20"/>
         </w:rPr>
-        <w:t>这道题触发点在在讨论传统记忆方式在人工智能条件下如何被重组和提升；材料既没有否定记忆的价值，也没有否定人工智能的作用，而是在新的技术条件下对旧有学习方式进行扬弃，因此符合辩证否定的结构</w:t>
+        <w:t>这道题触发点在讨论传统记忆方式在人工智能条件下如何被重组和提升；材料既没有否定记忆的价值，也没有否定人工智能的作用，而是在新的技术条件下对旧有学习方式进行扬弃，因此符合辩证否定的结构</w:t>
       </w:r>
     </w:p>
     <w:p>
@@ -14785,7 +14671,7 @@
           <w:b w:val="0"/>
           <w:sz w:val="20"/>
         </w:rPr>
-        <w:t>新事物发展 / 发展的观点</w:t>
+        <w:t>发展的观点 / 发展的普遍性</w:t>
       </w:r>
     </w:p>
     <w:p>
@@ -14899,7 +14785,7 @@
           <w:b w:val="0"/>
           <w:sz w:val="20"/>
         </w:rPr>
-        <w:t>发展观点 / 发展的普遍性</w:t>
+        <w:t>发展的观点 / 发展的普遍性</w:t>
       </w:r>
     </w:p>
     <w:p>
@@ -15127,7 +15013,7 @@
           <w:b w:val="0"/>
           <w:sz w:val="20"/>
         </w:rPr>
-        <w:t>辩证否定 / 守正创新</w:t>
+        <w:t>发展的观点 / 发展的普遍性</w:t>
       </w:r>
     </w:p>
     <w:p>
@@ -15737,7 +15623,7 @@
           <w:b w:val="0"/>
           <w:sz w:val="20"/>
         </w:rPr>
-        <w:t>触发点在在保留公共交通服务属性的基础上重构线路和站点布局；传统模式被扬弃后形成更贴合实际需求的新模式，所以可对应辩证否定</w:t>
+        <w:t>触发点在保留公共交通服务属性的基础上重构线路和站点布局；传统模式被扬弃后形成更贴合实际需求的新模式，所以可对应辩证否定</w:t>
       </w:r>
     </w:p>
     <w:p>
@@ -15968,7 +15854,7 @@
           <w:b w:val="0"/>
           <w:sz w:val="20"/>
         </w:rPr>
-        <w:t>发展观点 / 量变质变 / 渐进性与飞跃性</w:t>
+        <w:t>量变与质变 / 适度原则</w:t>
       </w:r>
     </w:p>
     <w:p>
@@ -16082,7 +15968,7 @@
           <w:b w:val="0"/>
           <w:sz w:val="20"/>
         </w:rPr>
-        <w:t>改革是社会主义社会发展的直接动力 / 社会主义制度自我完善和发展</w:t>
+        <w:t>量变与质变 / 适度原则</w:t>
       </w:r>
     </w:p>
     <w:p>
@@ -16361,7 +16247,7 @@
           <w:b w:val="0"/>
           <w:sz w:val="20"/>
         </w:rPr>
-        <w:t>量变与质变 / 发展的阶段性</w:t>
+        <w:t>量变与质变 / 适度原则</w:t>
       </w:r>
     </w:p>
     <w:p>
@@ -16498,7 +16384,7 @@
           <w:b w:val="0"/>
           <w:sz w:val="20"/>
         </w:rPr>
-        <w:t>题目触发点在在讲长期知识积累如何成为后续创造、联想、创新的前提条件；知识储备的不断增加属于量的积累，而创造力、灵感和创新能力的生成则体现为更高层次的转化效果，所以可对应量变与质变</w:t>
+        <w:t>题目触发点在讲长期知识积累如何成为后续创造、联想、创新的前提条件；知识储备的不断增加属于量的积累，而创造力、灵感和创新能力的生成则体现为更高层次的转化效果，所以可对应量变与质变</w:t>
       </w:r>
     </w:p>
     <w:p>
@@ -16589,7 +16475,7 @@
           <w:b w:val="0"/>
           <w:sz w:val="20"/>
         </w:rPr>
-        <w:t>认识反复性 / 实践观点 / 前进性曲折性 / 量变质变</w:t>
+        <w:t>量变与质变 / 适度原则</w:t>
       </w:r>
     </w:p>
     <w:p>
@@ -16817,7 +16703,7 @@
           <w:b w:val="0"/>
           <w:sz w:val="20"/>
         </w:rPr>
-        <w:t>量变与质变 / 渐进性与飞跃性的统一</w:t>
+        <w:t>量变与质变 / 适度原则</w:t>
       </w:r>
     </w:p>
     <w:p>
@@ -16931,7 +16817,7 @@
           <w:b w:val="0"/>
           <w:sz w:val="20"/>
         </w:rPr>
-        <w:t>量变质变 / 发展观点 / 动态性思维</w:t>
+        <w:t>量变与质变 / 适度原则</w:t>
       </w:r>
     </w:p>
     <w:p>
@@ -17045,7 +16931,7 @@
           <w:b w:val="0"/>
           <w:sz w:val="20"/>
         </w:rPr>
-        <w:t>发展观点 / 系统观念 / 量变质变</w:t>
+        <w:t>量变与质变 / 适度原则</w:t>
       </w:r>
     </w:p>
     <w:p>
@@ -17159,7 +17045,7 @@
           <w:b w:val="0"/>
           <w:sz w:val="20"/>
         </w:rPr>
-        <w:t>量变质变 / 适度原则</w:t>
+        <w:t>量变与质变 / 适度原则</w:t>
       </w:r>
     </w:p>
     <w:p>
@@ -17542,7 +17428,7 @@
           <w:b w:val="0"/>
           <w:sz w:val="20"/>
         </w:rPr>
-        <w:t>阅卷细则在辩证法层面列出“辩证否定等”；桑基鱼塘“未老”的原因触发点在在保留生态循环和农业智慧的基础上更新功能形态，实现传统农业资源的创造性利用，因此可稳定补入辩证否定栏目</w:t>
+        <w:t>阅卷细则在辩证法层面列出“辩证否定等”；桑基鱼塘“未老”的原因触发点在保留生态循环和农业智慧的基础上更新功能形态，实现传统农业资源的创造性利用，因此可稳定补入辩证否定栏目</w:t>
       </w:r>
     </w:p>
     <w:p>
@@ -17667,7 +17553,7 @@
           <w:b w:val="0"/>
           <w:sz w:val="20"/>
         </w:rPr>
-        <w:t>创造性转化、创新性发展 / 两个结合 / 文化自信</w:t>
+        <w:t>辩证否定 / 守正创新</w:t>
       </w:r>
     </w:p>
     <w:p>
@@ -17804,7 +17690,7 @@
           <w:b w:val="0"/>
           <w:sz w:val="20"/>
         </w:rPr>
-        <w:t>评标明确把“坚持辩证否定观”列入第17题可得2分的哲学角度；题目触发点在在继承农耕文明合理内核的基础上克服不合时宜的呈现方式，形成面向新时代的创造性转化</w:t>
+        <w:t>评标明确把“坚持辩证否定观”列入第17题可得2分的哲学角度；题目触发点在继承农耕文明合理内核的基础上克服不合时宜的呈现方式，形成面向新时代的创造性转化</w:t>
       </w:r>
     </w:p>
     <w:p>
@@ -17952,7 +17838,7 @@
           <w:b w:val="0"/>
           <w:sz w:val="20"/>
         </w:rPr>
-        <w:t>触发点在在保留春节团圆、祈愿、喜庆等精神核心的同时，把现代科技、现代休闲方式融入其中，使传统节日获得新形式和新内涵；这正体现了在继承基础上的扬弃和发展</w:t>
+        <w:t>触发点在保留春节团圆、祈愿、喜庆等精神核心的同时，把现代科技、现代休闲方式融入其中，使传统节日获得新形式和新内涵；这正体现了在继承基础上的扬弃和发展</w:t>
       </w:r>
     </w:p>
     <w:p>
@@ -18043,7 +17929,7 @@
           <w:b w:val="0"/>
           <w:sz w:val="20"/>
         </w:rPr>
-        <w:t>联系观点 / 发展观点 / 辩证否定</w:t>
+        <w:t>辩证否定 / 守正创新</w:t>
       </w:r>
     </w:p>
     <w:p>
@@ -18066,7 +17952,7 @@
           <w:b w:val="0"/>
           <w:sz w:val="20"/>
         </w:rPr>
-        <w:t>细则要求“哲学+文化”成层作答；三个地点都触发点在在历史文脉、现实场景、人民实践和时代需求之间建立联系：西安偏“传统与新潮交织”，敦煌偏“文明交流交融”，喀什偏“古韵新业协同”</w:t>
+        <w:t>细则要求“哲学+文化”成层作答；三个地点都触发点在历史文脉、现实场景、人民实践和时代需求之间建立联系：西安偏“传统与新潮交织”，敦煌偏“文明交流交融”，喀什偏“古韵新业协同”</w:t>
       </w:r>
     </w:p>
     <w:p>
@@ -18157,7 +18043,7 @@
           <w:b w:val="0"/>
           <w:sz w:val="20"/>
         </w:rPr>
-        <w:t>辩证否定 / 守正创新 / 内容与形式统一</w:t>
+        <w:t>辩证否定 / 守正创新</w:t>
       </w:r>
     </w:p>
     <w:p>
@@ -18180,7 +18066,7 @@
           <w:b w:val="0"/>
           <w:sz w:val="20"/>
         </w:rPr>
-        <w:t>材料的关键触发点在在保留昆曲内核的基础上更新舞台表达形式；正确项“守正创新、内容美与形式美统一”呈现继承与发展的扬弃结构，可稳定归入辩证否定和守正创新</w:t>
+        <w:t>材料的关键触发点在保留昆曲内核的基础上更新舞台表达形式；正确项“守正创新、内容美与形式美统一”呈现继承与发展的扬弃结构，可稳定归入辩证否定和守正创新</w:t>
       </w:r>
     </w:p>
     <w:p>
@@ -18385,7 +18271,7 @@
           <w:b w:val="0"/>
           <w:sz w:val="20"/>
         </w:rPr>
-        <w:t>辩证否定 / 发展观点 / 系统观念</w:t>
+        <w:t>辩证否定 / 守正创新</w:t>
       </w:r>
     </w:p>
     <w:p>
@@ -18408,7 +18294,7 @@
           <w:b w:val="0"/>
           <w:sz w:val="20"/>
         </w:rPr>
-        <w:t>触发点在在承认旧产业贡献和现实约束基础上破除路径依赖、培育新动能，形成产业转型、生态涵养和民生改善的系统发展链</w:t>
+        <w:t>触发点在承认旧产业贡献和现实约束基础上破除路径依赖、培育新动能，形成产业转型、生态涵养和民生改善的系统发展链</w:t>
       </w:r>
     </w:p>
     <w:p>
@@ -18613,7 +18499,7 @@
           <w:b w:val="0"/>
           <w:sz w:val="20"/>
         </w:rPr>
-        <w:t>发展观点 / 辩证否定</w:t>
+        <w:t>辩证否定 / 守正创新</w:t>
       </w:r>
     </w:p>
     <w:p>
@@ -18727,7 +18613,7 @@
           <w:b w:val="0"/>
           <w:sz w:val="20"/>
         </w:rPr>
-        <w:t>发展观点 / 辩证否定 / 守正创新</w:t>
+        <w:t>辩证否定 / 守正创新</w:t>
       </w:r>
     </w:p>
     <w:p>
@@ -18750,7 +18636,7 @@
           <w:b w:val="0"/>
           <w:sz w:val="20"/>
         </w:rPr>
-        <w:t>讲评 PPT 把发展观和辩证否定观列为可用角度；都江堰跨越千年的原因触发点在在保留“因势利导”核心智慧的同时，根据时代条件更新治理技术和传播方式，体现继承基础上的创新发展</w:t>
+        <w:t>讲评 PPT 把发展观和辩证否定观列为可用角度；都江堰跨越千年的原因触发点在保留“因势利导”核心智慧的同时，根据时代条件更新治理技术和传播方式，体现继承基础上的创新发展</w:t>
       </w:r>
     </w:p>
     <w:p>
@@ -18841,7 +18727,7 @@
           <w:b w:val="0"/>
           <w:sz w:val="20"/>
         </w:rPr>
-        <w:t>发展观点 / 辩证否定</w:t>
+        <w:t>辩证否定 / 守正创新</w:t>
       </w:r>
     </w:p>
     <w:p>
@@ -18964,7 +18850,7 @@
           <w:b w:val="0"/>
           <w:sz w:val="20"/>
         </w:rPr>
-        <w:t>矛盾就是对立统一 / 全面观点</w:t>
+        <w:t>矛盾就是对立统一</w:t>
       </w:r>
     </w:p>
     <w:p>
@@ -19095,7 +18981,7 @@
           <w:b w:val="0"/>
           <w:sz w:val="20"/>
         </w:rPr>
-        <w:t>对立统一 / 关系类设问方法</w:t>
+        <w:t>矛盾就是对立统一</w:t>
       </w:r>
     </w:p>
     <w:p>
@@ -19209,7 +19095,7 @@
           <w:b w:val="0"/>
           <w:sz w:val="20"/>
         </w:rPr>
-        <w:t>矛盾对立统一 / 辩证思维</w:t>
+        <w:t>矛盾就是对立统一</w:t>
       </w:r>
     </w:p>
     <w:p>
@@ -19323,7 +19209,7 @@
           <w:b w:val="0"/>
           <w:sz w:val="20"/>
         </w:rPr>
-        <w:t>矛盾就是对立统一 / 全面观点</w:t>
+        <w:t>矛盾就是对立统一</w:t>
       </w:r>
     </w:p>
     <w:p>
@@ -19346,7 +19232,7 @@
           <w:b w:val="0"/>
           <w:sz w:val="20"/>
         </w:rPr>
-        <w:t>评标明确列出“用对立统一/全面的观点看问题”；农耕文明的新面貌触发点在在传统保护和现代转化、乡土表达和数字技术、文化价值和产业发展之间作全面把握，体现对立双方在实践中的统一</w:t>
+        <w:t>评标明确列出“用对立统一/全面的观点看问题”；农耕文明的新面貌触发点在传统保护和现代转化、乡土表达和数字技术、文化价值和产业发展之间作全面把握，体现对立双方在实践中的统一</w:t>
       </w:r>
     </w:p>
     <w:p>
@@ -19471,7 +19357,7 @@
           <w:b w:val="0"/>
           <w:sz w:val="20"/>
         </w:rPr>
-        <w:t>联系普遍性 / 矛盾对立统一 / 价值观导向 / 人生价值</w:t>
+        <w:t>矛盾就是对立统一</w:t>
       </w:r>
     </w:p>
     <w:p>
@@ -19585,7 +19471,7 @@
           <w:b w:val="0"/>
           <w:sz w:val="20"/>
         </w:rPr>
-        <w:t>矛盾就是对立统一 / 一分为二看问题</w:t>
+        <w:t>矛盾就是对立统一</w:t>
       </w:r>
     </w:p>
     <w:p>
@@ -19813,7 +19699,7 @@
           <w:b w:val="0"/>
           <w:sz w:val="20"/>
         </w:rPr>
-        <w:t>发展观点 / 矛盾分析法 / 实践观点</w:t>
+        <w:t>矛盾就是对立统一</w:t>
       </w:r>
     </w:p>
     <w:p>
@@ -19927,7 +19813,7 @@
           <w:b w:val="0"/>
           <w:sz w:val="20"/>
         </w:rPr>
-        <w:t>矛盾就是对立统一 / 一分为二看问题</w:t>
+        <w:t>矛盾就是对立统一</w:t>
       </w:r>
     </w:p>
     <w:p>
@@ -20041,7 +19927,7 @@
           <w:b w:val="0"/>
           <w:sz w:val="20"/>
         </w:rPr>
-        <w:t>矛盾就是对立统一 / 一分为二看问题</w:t>
+        <w:t>矛盾就是对立统一</w:t>
       </w:r>
     </w:p>
     <w:p>
@@ -20155,7 +20041,7 @@
           <w:b w:val="0"/>
           <w:sz w:val="20"/>
         </w:rPr>
-        <w:t>矛盾就是对立统一 / 矛盾斗争性</w:t>
+        <w:t>矛盾就是对立统一</w:t>
       </w:r>
     </w:p>
     <w:p>
@@ -20269,7 +20155,7 @@
           <w:b w:val="0"/>
           <w:sz w:val="20"/>
         </w:rPr>
-        <w:t>矛盾运动观点 / 动态性思维 / 生态价值转化</w:t>
+        <w:t>矛盾就是对立统一</w:t>
       </w:r>
     </w:p>
     <w:p>
@@ -20292,7 +20178,7 @@
           <w:b w:val="0"/>
           <w:sz w:val="20"/>
         </w:rPr>
-        <w:t>生态价值触发点在在保护与转化、政府与市场、经济价值与社会价值的互动中实现；正确项强调用矛盾运动观点动态思考，说明答题要抓住生态保护和价值实现之间的辩证关系</w:t>
+        <w:t>生态价值触发点在保护与转化、政府与市场、经济价值与社会价值的互动中实现；正确项强调用矛盾运动观点动态思考，说明答题要抓住生态保护和价值实现之间的辩证关系</w:t>
       </w:r>
     </w:p>
     <w:p>
@@ -20383,7 +20269,7 @@
           <w:b w:val="0"/>
           <w:sz w:val="20"/>
         </w:rPr>
-        <w:t>矛盾就是对立统一 / 一分为二看问题</w:t>
+        <w:t>矛盾就是对立统一</w:t>
       </w:r>
     </w:p>
     <w:p>
@@ -20497,7 +20383,7 @@
           <w:b w:val="0"/>
           <w:sz w:val="20"/>
         </w:rPr>
-        <w:t>对立统一 / 矛盾分析法</w:t>
+        <w:t>矛盾就是对立统一</w:t>
       </w:r>
     </w:p>
     <w:p>
@@ -20520,7 +20406,7 @@
           <w:b w:val="0"/>
           <w:sz w:val="20"/>
         </w:rPr>
-        <w:t>材料中的“古老”与“现代”、“传承”与“创新”触发点在在数字化实践中相互制约又相互成就，因此触发对立统一</w:t>
+        <w:t>材料中的“古老”与“现代”、“传承”与“创新”触发点在数字化实践中相互制约又相互成就，因此触发对立统一</w:t>
       </w:r>
     </w:p>
     <w:p>
@@ -20611,7 +20497,7 @@
           <w:b w:val="0"/>
           <w:sz w:val="20"/>
         </w:rPr>
-        <w:t>矛盾就是对立统一 / 一分为二看问题</w:t>
+        <w:t>矛盾就是对立统一</w:t>
       </w:r>
     </w:p>
     <w:p>
@@ -20839,7 +20725,7 @@
           <w:b w:val="0"/>
           <w:sz w:val="20"/>
         </w:rPr>
-        <w:t>矛盾对立统一 / 适度原则 / 量变质变</w:t>
+        <w:t>矛盾就是对立统一</w:t>
       </w:r>
     </w:p>
     <w:p>
@@ -21181,7 +21067,7 @@
           <w:b w:val="0"/>
           <w:sz w:val="20"/>
         </w:rPr>
-        <w:t>矛盾就是对立统一 / 一分为二 / 全面观点</w:t>
+        <w:t>矛盾就是对立统一</w:t>
       </w:r>
     </w:p>
     <w:p>
@@ -21295,7 +21181,7 @@
           <w:b w:val="0"/>
           <w:sz w:val="20"/>
         </w:rPr>
-        <w:t>矛盾分析法 / 对立统一 / 全面观点</w:t>
+        <w:t>矛盾就是对立统一</w:t>
       </w:r>
     </w:p>
     <w:p>
@@ -21409,7 +21295,7 @@
           <w:b w:val="0"/>
           <w:sz w:val="20"/>
         </w:rPr>
-        <w:t>对立统一 / 一分为二</w:t>
+        <w:t>矛盾就是对立统一</w:t>
       </w:r>
     </w:p>
     <w:p>
@@ -21637,7 +21523,7 @@
           <w:b w:val="0"/>
           <w:sz w:val="20"/>
         </w:rPr>
-        <w:t>人为事物联系 / 矛盾对立统一 / 个体与整体</w:t>
+        <w:t>矛盾就是对立统一</w:t>
       </w:r>
     </w:p>
     <w:p>
@@ -21988,7 +21874,7 @@
           <w:b w:val="0"/>
           <w:sz w:val="20"/>
         </w:rPr>
-        <w:t>矛盾普遍性 / 生命观 / 价值反思</w:t>
+        <w:t>矛盾的普遍性</w:t>
       </w:r>
     </w:p>
     <w:p>
@@ -22102,7 +21988,7 @@
           <w:b w:val="0"/>
           <w:sz w:val="20"/>
         </w:rPr>
-        <w:t>对立统一 / 矛盾普遍性</w:t>
+        <w:t>矛盾的普遍性</w:t>
       </w:r>
     </w:p>
     <w:p>
@@ -22216,7 +22102,7 @@
           <w:b w:val="0"/>
           <w:sz w:val="20"/>
         </w:rPr>
-        <w:t>矛盾的普遍性 / 承认矛盾</w:t>
+        <w:t>矛盾的普遍性</w:t>
       </w:r>
     </w:p>
     <w:p>
@@ -22330,7 +22216,7 @@
           <w:b w:val="0"/>
           <w:sz w:val="20"/>
         </w:rPr>
-        <w:t>矛盾普遍性 / 对立统一 / 一分为二 / 全面观点</w:t>
+        <w:t>矛盾的普遍性</w:t>
       </w:r>
     </w:p>
     <w:p>
@@ -22453,7 +22339,7 @@
           <w:b w:val="0"/>
           <w:sz w:val="20"/>
         </w:rPr>
-        <w:t>具体问题具体分析 / 主次矛盾 / 优势互补</w:t>
+        <w:t>矛盾的特殊性 / 具体问题具体分析</w:t>
       </w:r>
     </w:p>
     <w:p>
@@ -22715,7 +22601,7 @@
           <w:b w:val="0"/>
           <w:sz w:val="20"/>
         </w:rPr>
-        <w:t>具体问题具体分析 / 问题导向</w:t>
+        <w:t>矛盾的特殊性 / 具体问题具体分析</w:t>
       </w:r>
     </w:p>
     <w:p>
@@ -22829,7 +22715,7 @@
           <w:b w:val="0"/>
           <w:sz w:val="20"/>
         </w:rPr>
-        <w:t>价值判断与价值选择 / 人民群众 / 具体问题具体分析</w:t>
+        <w:t>矛盾的特殊性 / 具体问题具体分析</w:t>
       </w:r>
     </w:p>
     <w:p>
@@ -23091,7 +22977,7 @@
           <w:b w:val="0"/>
           <w:sz w:val="20"/>
         </w:rPr>
-        <w:t>整体与部分 / 系统优化 / 矛盾分析法 / 具体问题具体分析</w:t>
+        <w:t>矛盾的特殊性 / 具体问题具体分析</w:t>
       </w:r>
     </w:p>
     <w:p>
@@ -23712,7 +23598,7 @@
           <w:b w:val="0"/>
           <w:sz w:val="20"/>
         </w:rPr>
-        <w:t>矛盾特殊性 / 具体问题具体分析</w:t>
+        <w:t>矛盾的特殊性 / 具体问题具体分析</w:t>
       </w:r>
     </w:p>
     <w:p>
@@ -24063,7 +23949,7 @@
           <w:b w:val="0"/>
           <w:sz w:val="20"/>
         </w:rPr>
-        <w:t>矛盾普遍性与特殊性 / 文化多样性 / 联系观点</w:t>
+        <w:t>矛盾的普遍性和特殊性</w:t>
       </w:r>
     </w:p>
     <w:p>
@@ -24177,7 +24063,7 @@
           <w:b w:val="0"/>
           <w:sz w:val="20"/>
         </w:rPr>
-        <w:t>矛盾对立统一 / 矛盾普遍性与特殊性</w:t>
+        <w:t>矛盾的普遍性和特殊性</w:t>
       </w:r>
     </w:p>
     <w:p>
@@ -24291,7 +24177,7 @@
           <w:b w:val="0"/>
           <w:sz w:val="20"/>
         </w:rPr>
-        <w:t>矛盾普遍性和特殊性 / 具体问题具体分析</w:t>
+        <w:t>矛盾的普遍性和特殊性</w:t>
       </w:r>
     </w:p>
     <w:p>
@@ -24879,7 +24765,7 @@
           <w:b w:val="0"/>
           <w:sz w:val="20"/>
         </w:rPr>
-        <w:t>两点论和重点论统一 / 价值引领</w:t>
+        <w:t>两点论与重点论</w:t>
       </w:r>
     </w:p>
     <w:p>
@@ -25002,7 +24888,7 @@
           <w:b w:val="0"/>
           <w:sz w:val="20"/>
         </w:rPr>
-        <w:t>内外因 / 矛盾分析法 / 党的建设</w:t>
+        <w:t>内因与外因</w:t>
       </w:r>
     </w:p>
     <w:p>
@@ -25116,7 +25002,7 @@
           <w:b w:val="0"/>
           <w:sz w:val="20"/>
         </w:rPr>
-        <w:t>内外因 / 矛盾分析法</w:t>
+        <w:t>内因与外因</w:t>
       </w:r>
     </w:p>
     <w:p>
@@ -25247,7 +25133,7 @@
           <w:b w:val="0"/>
           <w:sz w:val="20"/>
         </w:rPr>
-        <w:t>内外因 / 矛盾分析法</w:t>
+        <w:t>内因与外因</w:t>
       </w:r>
     </w:p>
     <w:p>
@@ -25909,7 +25795,7 @@
           <w:b w:val="0"/>
           <w:sz w:val="20"/>
         </w:rPr>
-        <w:t>题目把前期学习、实地体验和后续行动串成一个连续过程，说明对《诗经》及其文化内涵的理解触发点在在知与行相互推进中不断深化；材料本身就构成了一条“以知导行、在行中深化知”的链条，所以可对应实践与认识</w:t>
+        <w:t>题目把前期学习、实地体验和后续行动串成一个连续过程，说明对《诗经》及其文化内涵的理解触发点在知与行相互推进中不断深化；材料本身就构成了一条“以知导行、在行中深化知”的链条，所以可对应实践与认识</w:t>
       </w:r>
     </w:p>
     <w:p>
@@ -26114,7 +26000,7 @@
           <w:b w:val="0"/>
           <w:sz w:val="20"/>
         </w:rPr>
-        <w:t>实践与认识 / 实践观点</w:t>
+        <w:t>实践与认识</w:t>
       </w:r>
     </w:p>
     <w:p>
@@ -26228,7 +26114,7 @@
           <w:b w:val="0"/>
           <w:sz w:val="20"/>
         </w:rPr>
-        <w:t>实践与认识 / 实践观点</w:t>
+        <w:t>实践与认识</w:t>
       </w:r>
     </w:p>
     <w:p>
@@ -26351,7 +26237,7 @@
           <w:b w:val="0"/>
           <w:sz w:val="20"/>
         </w:rPr>
-        <w:t>实践是认识的基础 / 认识反作用于实践 / 知行合一</w:t>
+        <w:t>实践是认识的基础</w:t>
       </w:r>
     </w:p>
     <w:p>
@@ -26465,7 +26351,7 @@
           <w:b w:val="0"/>
           <w:sz w:val="20"/>
         </w:rPr>
-        <w:t>实践是认识的基础 / 实践是认识发展的动力 / 实践是检验认识真理性的唯一标准</w:t>
+        <w:t>实践是认识的基础</w:t>
       </w:r>
     </w:p>
     <w:p>
@@ -26579,7 +26465,7 @@
           <w:b w:val="0"/>
           <w:sz w:val="20"/>
         </w:rPr>
-        <w:t>实践是认识的基础 / 实践第一观点</w:t>
+        <w:t>实践是认识的基础</w:t>
       </w:r>
     </w:p>
     <w:p>
@@ -26702,7 +26588,7 @@
           <w:b w:val="0"/>
           <w:sz w:val="20"/>
         </w:rPr>
-        <w:t>社会存在与社会意识 / 认识发展 / 技术反作用</w:t>
+        <w:t>认识发展原理</w:t>
       </w:r>
     </w:p>
     <w:p>
@@ -26725,7 +26611,7 @@
           <w:b w:val="0"/>
           <w:sz w:val="20"/>
         </w:rPr>
-        <w:t>人工智能作为新的社会存在和生产工具，会改变生产生活场景、信息环境和认知方式，进而塑造人的观念与行为；不能只写“人控制AI”，还要写技术反过来影响人</w:t>
+        <w:t>人工智能作为新的社会存在和生产工具，会改变生产生活场景、信息环境和认知方式，进而塑造人的观念与行为；不要停留在“人控制AI”，还要写技术反过来影响人</w:t>
       </w:r>
     </w:p>
     <w:p>
@@ -26816,7 +26702,7 @@
           <w:b w:val="0"/>
           <w:sz w:val="20"/>
         </w:rPr>
-        <w:t>哲学起源 / 认识发展 / 理性认识</w:t>
+        <w:t>认识发展原理</w:t>
       </w:r>
     </w:p>
     <w:p>
@@ -26930,7 +26816,7 @@
           <w:b w:val="0"/>
           <w:sz w:val="20"/>
         </w:rPr>
-        <w:t>实践决定认识 / 认识发展 / 感性认识到理性认识</w:t>
+        <w:t>认识发展原理</w:t>
       </w:r>
     </w:p>
     <w:p>
@@ -27044,7 +26930,7 @@
           <w:b w:val="0"/>
           <w:sz w:val="20"/>
         </w:rPr>
-        <w:t>认识具有反复性 / 无限性 / 上升性</w:t>
+        <w:t>认识发展原理</w:t>
       </w:r>
     </w:p>
     <w:p>
@@ -27067,7 +26953,7 @@
           <w:b w:val="0"/>
           <w:sz w:val="20"/>
         </w:rPr>
-        <w:t>科学认识触发点在在已有认识被实践否定、修正、再探索的过程中逐步接近规律；材料用永动机失败到能量守恒定律发现的过程，呈现出认识发展的反复推进</w:t>
+        <w:t>科学认识触发点在已有认识被实践否定、修正、再探索的过程中逐步接近规律；材料用永动机失败到能量守恒定律发现的过程，呈现出认识发展的反复推进</w:t>
       </w:r>
     </w:p>
     <w:p>
@@ -27158,7 +27044,7 @@
           <w:b w:val="0"/>
           <w:sz w:val="20"/>
         </w:rPr>
-        <w:t>认识发展 / 认识上升性</w:t>
+        <w:t>认识发展原理</w:t>
       </w:r>
     </w:p>
     <w:p>
@@ -27281,7 +27167,7 @@
           <w:b w:val="0"/>
           <w:sz w:val="20"/>
         </w:rPr>
-        <w:t>认识受主客观条件制约 / 真理性认识的条件性</w:t>
+        <w:t>真理观</w:t>
       </w:r>
     </w:p>
     <w:p>
@@ -27395,7 +27281,7 @@
           <w:b w:val="0"/>
           <w:sz w:val="20"/>
         </w:rPr>
-        <w:t>实践是检验认识真理性的唯一标准 / 认识具有过程性</w:t>
+        <w:t>真理观</w:t>
       </w:r>
     </w:p>
     <w:p>
@@ -27509,7 +27395,7 @@
           <w:b w:val="0"/>
           <w:sz w:val="20"/>
         </w:rPr>
-        <w:t>真理是具体的有条件的 / 实践与认识</w:t>
+        <w:t>真理观</w:t>
       </w:r>
     </w:p>
     <w:p>
@@ -27755,7 +27641,7 @@
           <w:b w:val="0"/>
           <w:sz w:val="20"/>
         </w:rPr>
-        <w:t>社会存在决定社会意识 / 社会存在变化决定社会意识变化</w:t>
+        <w:t>社会存在与社会意识</w:t>
       </w:r>
     </w:p>
     <w:p>
@@ -27903,7 +27789,7 @@
           <w:b w:val="0"/>
           <w:sz w:val="20"/>
         </w:rPr>
-        <w:t>社会意识 / 文化精神 / 价值观导向</w:t>
+        <w:t>社会存在与社会意识</w:t>
       </w:r>
     </w:p>
     <w:p>
@@ -28131,7 +28017,7 @@
           <w:b w:val="0"/>
           <w:sz w:val="20"/>
         </w:rPr>
-        <w:t>社会存在与社会意识 / 社会存在决定社会意识 / 社会意识具有反作用</w:t>
+        <w:t>社会存在与社会意识</w:t>
       </w:r>
     </w:p>
     <w:p>
@@ -28262,7 +28148,7 @@
           <w:b w:val="0"/>
           <w:sz w:val="20"/>
         </w:rPr>
-        <w:t>社会意识的反作用 / 正确认识指导实践 / 党的领导</w:t>
+        <w:t>社会存在与社会意识</w:t>
       </w:r>
     </w:p>
     <w:p>
@@ -28499,7 +28385,7 @@
           <w:b w:val="0"/>
           <w:sz w:val="20"/>
         </w:rPr>
-        <w:t>改革 / 生产关系适应生产力 / 上层建筑反作用</w:t>
+        <w:t>社会发展的两大基本规律和基本矛盾</w:t>
       </w:r>
     </w:p>
     <w:p>
@@ -28630,7 +28516,7 @@
           <w:b w:val="0"/>
           <w:sz w:val="20"/>
         </w:rPr>
-        <w:t>生产关系适应生产力 / 改革 / 上层建筑反作用</w:t>
+        <w:t>社会发展的两大基本规律和基本矛盾</w:t>
       </w:r>
     </w:p>
     <w:p>
@@ -28744,7 +28630,7 @@
           <w:b w:val="0"/>
           <w:sz w:val="20"/>
         </w:rPr>
-        <w:t>上层建筑适应经济基础 / 具体问题具体分析 / 主体措施链</w:t>
+        <w:t>社会发展的两大基本规律和基本矛盾</w:t>
       </w:r>
     </w:p>
     <w:p>
@@ -28858,7 +28744,7 @@
           <w:b w:val="0"/>
           <w:sz w:val="20"/>
         </w:rPr>
-        <w:t>社会基本矛盾 / 生产关系适应生产力 / 改革</w:t>
+        <w:t>社会发展的两大基本规律和基本矛盾</w:t>
       </w:r>
     </w:p>
     <w:p>
@@ -28972,7 +28858,7 @@
           <w:b w:val="0"/>
           <w:sz w:val="20"/>
         </w:rPr>
-        <w:t>生产力与生产关系 / 经济基础与上层建筑 / 社会基本矛盾运动</w:t>
+        <w:t>社会发展的两大基本规律和基本矛盾</w:t>
       </w:r>
     </w:p>
     <w:p>
@@ -29120,7 +29006,7 @@
           <w:b w:val="0"/>
           <w:sz w:val="20"/>
         </w:rPr>
-        <w:t>生产力与生产关系 / 经济基础与上层建筑 / 社会基本矛盾运动</w:t>
+        <w:t>社会发展的两大基本规律和基本矛盾</w:t>
       </w:r>
     </w:p>
     <w:p>
@@ -29251,7 +29137,7 @@
           <w:b w:val="0"/>
           <w:sz w:val="20"/>
         </w:rPr>
-        <w:t>社会基本矛盾 / 生产关系适应生产力 / 改革</w:t>
+        <w:t>社会发展的两大基本规律和基本矛盾</w:t>
       </w:r>
     </w:p>
     <w:p>
@@ -29479,7 +29365,7 @@
           <w:b w:val="0"/>
           <w:sz w:val="20"/>
         </w:rPr>
-        <w:t>上层建筑适应经济基础 / 社会意识的反作用 / 正确认识指导实践</w:t>
+        <w:t>社会发展的两大基本规律和基本矛盾</w:t>
       </w:r>
     </w:p>
     <w:p>
@@ -29602,7 +29488,7 @@
           <w:b w:val="0"/>
           <w:sz w:val="20"/>
         </w:rPr>
-        <w:t>改革 / 改革的实质 / 生产关系适应生产力</w:t>
+        <w:t>改革 / 改革的实质</w:t>
       </w:r>
     </w:p>
     <w:p>
@@ -29733,7 +29619,7 @@
           <w:b w:val="0"/>
           <w:sz w:val="20"/>
         </w:rPr>
-        <w:t>改革的实质 / 社会基本矛盾运动</w:t>
+        <w:t>改革 / 改革的实质</w:t>
       </w:r>
     </w:p>
     <w:p>
@@ -29873,7 +29759,7 @@
           <w:b w:val="0"/>
           <w:sz w:val="20"/>
         </w:rPr>
-        <w:t>人民群众 / 群众观点</w:t>
+        <w:t>人民群众</w:t>
       </w:r>
     </w:p>
     <w:p>
@@ -30021,7 +29907,7 @@
           <w:b w:val="0"/>
           <w:sz w:val="20"/>
         </w:rPr>
-        <w:t>人民群众 / 价值观导向 / 人类命运共同体</w:t>
+        <w:t>人民群众</w:t>
       </w:r>
     </w:p>
     <w:p>
@@ -30044,7 +29930,7 @@
           <w:b w:val="0"/>
           <w:sz w:val="20"/>
         </w:rPr>
-        <w:t>评标等级要求围绕观点展开综合论述；材料中的“共同事业、共同理想、共同追求”提示答题不能只写国际关系术语，还要落到人民对美好生活的共同需要</w:t>
+        <w:t>评标等级要求围绕观点展开综合论述；材料中的“共同事业、共同理想、共同追求”提示答题不要停留在国际关系术语，还要落到人民对美好生活的共同需要</w:t>
       </w:r>
     </w:p>
     <w:p>
@@ -30135,7 +30021,7 @@
           <w:b w:val="0"/>
           <w:sz w:val="20"/>
         </w:rPr>
-        <w:t>人生价值 / 人民群众 / 个人与社会统一</w:t>
+        <w:t>人民群众</w:t>
       </w:r>
     </w:p>
     <w:p>
@@ -30249,7 +30135,7 @@
           <w:b w:val="0"/>
           <w:sz w:val="20"/>
         </w:rPr>
-        <w:t>人民立场 / 人民群众 / 价值观导向</w:t>
+        <w:t>人民群众</w:t>
       </w:r>
     </w:p>
     <w:p>
@@ -30363,7 +30249,7 @@
           <w:b w:val="0"/>
           <w:sz w:val="20"/>
         </w:rPr>
-        <w:t>人民群众是社会历史的主体和创造者 / 群众观点和群众路线</w:t>
+        <w:t>人民群众</w:t>
       </w:r>
     </w:p>
     <w:p>
@@ -30511,7 +30397,7 @@
           <w:b w:val="0"/>
           <w:sz w:val="20"/>
         </w:rPr>
-        <w:t>人民群众的历史作用 / 群众观点</w:t>
+        <w:t>人民群众</w:t>
       </w:r>
     </w:p>
     <w:p>
@@ -30642,7 +30528,7 @@
           <w:b w:val="0"/>
           <w:sz w:val="20"/>
         </w:rPr>
-        <w:t>人民群众是历史的创造者 / 群众观点</w:t>
+        <w:t>人民群众</w:t>
       </w:r>
     </w:p>
     <w:p>
@@ -30773,7 +30659,7 @@
           <w:b w:val="0"/>
           <w:sz w:val="20"/>
         </w:rPr>
-        <w:t>人民群众是历史的创造者 / 群众路线</w:t>
+        <w:t>人民群众</w:t>
       </w:r>
     </w:p>
     <w:p>
@@ -30887,7 +30773,7 @@
           <w:b w:val="0"/>
           <w:sz w:val="20"/>
         </w:rPr>
-        <w:t>人民群众 / 价值观导向 / 价值判断与价值选择</w:t>
+        <w:t>人民群众</w:t>
       </w:r>
     </w:p>
     <w:p>
@@ -31115,7 +31001,7 @@
           <w:b w:val="0"/>
           <w:sz w:val="20"/>
         </w:rPr>
-        <w:t>人民群众 / 人民立场</w:t>
+        <w:t>人民群众</w:t>
       </w:r>
     </w:p>
     <w:p>
@@ -31360,7 +31246,7 @@
           <w:b w:val="0"/>
           <w:sz w:val="20"/>
         </w:rPr>
-        <w:t>人民群众 / 群众观点</w:t>
+        <w:t>人民群众</w:t>
       </w:r>
     </w:p>
     <w:p>
@@ -31491,7 +31377,7 @@
           <w:b w:val="0"/>
           <w:sz w:val="20"/>
         </w:rPr>
-        <w:t>人民群众 / 价值观导向 / 中华优秀传统文化</w:t>
+        <w:t>人民群众</w:t>
       </w:r>
     </w:p>
     <w:p>
@@ -31737,7 +31623,7 @@
           <w:b w:val="0"/>
           <w:sz w:val="20"/>
         </w:rPr>
-        <w:t>价值观导向 / 人民立场 / 文化自信</w:t>
+        <w:t>价值观的导向作用</w:t>
       </w:r>
     </w:p>
     <w:p>
@@ -31851,7 +31737,7 @@
           <w:b w:val="0"/>
           <w:sz w:val="20"/>
         </w:rPr>
-        <w:t>价值观的导向作用 / 正确价值观</w:t>
+        <w:t>价值观的导向作用</w:t>
       </w:r>
     </w:p>
     <w:p>
@@ -31999,7 +31885,7 @@
           <w:b w:val="0"/>
           <w:sz w:val="20"/>
         </w:rPr>
-        <w:t>革命文化 / 长征精神 / 价值观导向</w:t>
+        <w:t>价值观的导向作用</w:t>
       </w:r>
     </w:p>
     <w:p>
@@ -32113,7 +31999,7 @@
           <w:b w:val="0"/>
           <w:sz w:val="20"/>
         </w:rPr>
-        <w:t>价值观的导向作用 / 理想信念</w:t>
+        <w:t>价值观的导向作用</w:t>
       </w:r>
     </w:p>
     <w:p>
@@ -32244,7 +32130,7 @@
           <w:b w:val="0"/>
           <w:sz w:val="20"/>
         </w:rPr>
-        <w:t>价值观导向 / 民族精神 / 实践奋斗</w:t>
+        <w:t>价值观的导向作用</w:t>
       </w:r>
     </w:p>
     <w:p>
@@ -32643,7 +32529,7 @@
           <w:b w:val="0"/>
           <w:sz w:val="20"/>
         </w:rPr>
-        <w:t>题干触发点在在借“公私”引出处事取向和行为选择的不同；一个人围绕什么利益、站在什么立场，会直接影响其看问题和做事情的方向，因此这里可对应价值观导向作用</w:t>
+        <w:t>题干触发点在借“公私”引出处事取向和行为选择的不同；一个人围绕什么利益、站在什么立场，会直接影响其看问题和做事情的方向，因此这里可对应价值观导向作用</w:t>
       </w:r>
     </w:p>
     <w:p>
@@ -32979,7 +32865,7 @@
           <w:b w:val="0"/>
           <w:sz w:val="20"/>
         </w:rPr>
-        <w:t>党的领导 / 价值导向 / 人民立场</w:t>
+        <w:t>价值观的导向作用</w:t>
       </w:r>
     </w:p>
     <w:p>
@@ -33093,7 +32979,7 @@
           <w:b w:val="0"/>
           <w:sz w:val="20"/>
         </w:rPr>
-        <w:t>价值观的导向作用 / 生态价值观</w:t>
+        <w:t>价值观的导向作用</w:t>
       </w:r>
     </w:p>
     <w:p>
@@ -34538,7 +34424,7 @@
           <w:b w:val="0"/>
           <w:sz w:val="20"/>
         </w:rPr>
-        <w:t>人生价值 / 价值判断与价值选择 / 民族精神和时代精神</w:t>
+        <w:t>价值判断与价值选择</w:t>
       </w:r>
     </w:p>
     <w:p>
@@ -34652,7 +34538,7 @@
           <w:b w:val="0"/>
           <w:sz w:val="20"/>
         </w:rPr>
-        <w:t>价值判断与价值选择 / 人与自然生命共同体</w:t>
+        <w:t>价值判断与价值选择</w:t>
       </w:r>
     </w:p>
     <w:p>
@@ -34897,7 +34783,7 @@
           <w:b w:val="0"/>
           <w:sz w:val="20"/>
         </w:rPr>
-        <w:t>价值观的导向作用 / 价值判断与价值选择</w:t>
+        <w:t>价值判断与价值选择</w:t>
       </w:r>
     </w:p>
     <w:p>
@@ -35011,7 +34897,7 @@
           <w:b w:val="0"/>
           <w:sz w:val="20"/>
         </w:rPr>
-        <w:t>价值观导向 / 价值判断与价值选择</w:t>
+        <w:t>价值判断与价值选择</w:t>
       </w:r>
     </w:p>
     <w:p>
@@ -35353,7 +35239,7 @@
           <w:b w:val="0"/>
           <w:sz w:val="20"/>
         </w:rPr>
-        <w:t>主观与客观具体的历史的统一 / 正确价值判断与价值选择</w:t>
+        <w:t>价值判断与价值选择</w:t>
       </w:r>
     </w:p>
     <w:p>
@@ -35467,7 +35353,7 @@
           <w:b w:val="0"/>
           <w:sz w:val="20"/>
         </w:rPr>
-        <w:t>价值观导向 / 价值判断与价值选择</w:t>
+        <w:t>价值判断与价值选择</w:t>
       </w:r>
     </w:p>
     <w:p>
@@ -35490,7 +35376,7 @@
           <w:b w:val="0"/>
           <w:sz w:val="20"/>
         </w:rPr>
-        <w:t>角色改写并触发点在在传统忠孝叙事与当代自我认知之间作价值选择，使作品能够引导青年理解自我、命运和责任，因此触发价值观导向</w:t>
+        <w:t>角色改写并触发点在传统忠孝叙事与当代自我认知之间作价值选择，使作品能够引导青年理解自我、命运和责任，因此触发价值观导向</w:t>
       </w:r>
     </w:p>
     <w:p>
@@ -35581,7 +35467,7 @@
           <w:b w:val="0"/>
           <w:sz w:val="20"/>
         </w:rPr>
-        <w:t>价值判断与价值选择 / 社会生活与技术互动</w:t>
+        <w:t>价值判断与价值选择</w:t>
       </w:r>
     </w:p>
     <w:p>
@@ -35923,7 +35809,7 @@
           <w:b w:val="0"/>
           <w:sz w:val="20"/>
         </w:rPr>
-        <w:t>发展观点 / 联系观点 / 价值判断与价值选择 / 人民立场</w:t>
+        <w:t>价值判断与价值选择</w:t>
       </w:r>
     </w:p>
     <w:p>
@@ -36999,7 +36885,7 @@
           <w:b w:val="0"/>
           <w:sz w:val="20"/>
         </w:rPr>
-        <w:t>文化角度不能只写“传统文化好”，而要说明留白为何是中华美学智慧：它以少胜多、以虚显实，丰富人的精神世界，也让学生理解中华文化博大精深和独特审美价值</w:t>
+        <w:t>文化角度不要停留在“传统文化好”，而要说明留白为何是中华美学智慧：它以少胜多、以虚显实，丰富人的精神世界，也让学生理解中华文化博大精深和独特审美价值</w:t>
       </w:r>
     </w:p>
     <w:p>

</xml_diff>

<commit_message>
Remove unsupported Dongcheng Q21 actuality trigger
</commit_message>
<xml_diff>
--- a/reports/final_deliverables/必修四哲学_深层触发点版_2026-04-27/outputs/必修四哲学材料-知识触发总框架_深层触发点版_2026-04-27.docx
+++ b/reports/final_deliverables/必修四哲学_深层触发点版_2026-04-27/outputs/必修四哲学材料-知识触发总框架_深层触发点版_2026-04-27.docx
@@ -702,7 +702,7 @@
           <w:b w:val="0"/>
           <w:sz w:val="21"/>
         </w:rPr>
-        <w:t>段意触发：我国发展具备党的坚强领导、制度优势、持续快速发展和坚实基础、长期稳定社会环境、自信自强精神力量等战略性有利条件</w:t>
+        <w:t>段意触发：当今世界面临不稳定性与不确定性，人类面临许多共同挑战，全人类共同价值契合时代发展需要</w:t>
       </w:r>
     </w:p>
     <w:p>
@@ -725,7 +725,7 @@
           <w:b w:val="0"/>
           <w:sz w:val="20"/>
         </w:rPr>
-        <w:t>我国发展具备党的坚强领导、制度优势、持续快速发展和坚实基础、长期稳定社会环境、自信自强精神力量等战略性有利条件</w:t>
+        <w:t>当今世界面临不稳定性与不确定性，人类面临许多共同挑战，全人类共同价值契合时代发展需要</w:t>
       </w:r>
     </w:p>
     <w:p>
@@ -771,7 +771,7 @@
           <w:b w:val="0"/>
           <w:sz w:val="20"/>
         </w:rPr>
-        <w:t>核心触发词是“战略性有利条件”：发展判断的依据落在党的领导、制度优势、物质基础、稳定环境和精神力量这些现实条件上。</w:t>
+        <w:t>核心触发词是“不稳定性与不确定性、共同挑战”：全人类共同价值是针对世界现实困境和时代需要作出的价值回应。</w:t>
       </w:r>
     </w:p>
     <w:p>
@@ -794,7 +794,7 @@
           <w:b w:val="0"/>
           <w:sz w:val="20"/>
         </w:rPr>
-        <w:t>2024北京东城高三二模 第21题；A细则/阅卷/评分标准直接支持</w:t>
+        <w:t>2024北京丰台高三一模 第21题；B评标/讲评角度清单；材料链为整理者解释</w:t>
       </w:r>
     </w:p>
     <w:p>
@@ -816,7 +816,7 @@
           <w:b w:val="0"/>
           <w:sz w:val="21"/>
         </w:rPr>
-        <w:t>段意触发：当今世界面临不稳定性与不确定性，人类面临许多共同挑战，全人类共同价值契合时代发展需要</w:t>
+        <w:t>正确项：③立足福州实际，深刻认识并准确把握福州的特点和优势，④统筹全局、系统谋划，为高质量发展做好顶层设计</w:t>
       </w:r>
     </w:p>
     <w:p>
@@ -839,7 +839,7 @@
           <w:b w:val="0"/>
           <w:sz w:val="20"/>
         </w:rPr>
-        <w:t>当今世界面临不稳定性与不确定性，人类面临许多共同挑战，全人类共同价值契合时代发展需要</w:t>
+        <w:t>正确项③写“立足福州实际，深刻认识并准确把握福州的特点和优势”，④写“统筹全局、系统谋划，为高质量发展做好顶层设计”</w:t>
       </w:r>
     </w:p>
     <w:p>
@@ -885,7 +885,7 @@
           <w:b w:val="0"/>
           <w:sz w:val="20"/>
         </w:rPr>
-        <w:t>核心触发词是“不稳定性与不确定性、共同挑战”：全人类共同价值是针对世界现实困境和时代需要作出的价值回应。</w:t>
+        <w:t>真正触发一切从实际出发的是“立足福州实际”和“把握福州的特点和优势”：方案先贴住福州的具体市情、特点和优势，再形成发展规划。</w:t>
       </w:r>
     </w:p>
     <w:p>
@@ -908,7 +908,7 @@
           <w:b w:val="0"/>
           <w:sz w:val="20"/>
         </w:rPr>
-        <w:t>2024北京丰台高三一模 第21题；B评标/讲评角度清单；材料链为整理者解释</w:t>
+        <w:t>2024北京丰台高三一模 第8题；C选择题正确项；有可靠答案源</w:t>
       </w:r>
     </w:p>
     <w:p>
@@ -923,120 +923,6 @@
           <w:sz w:val="21"/>
         </w:rPr>
         <w:t>5. 真正触发点：</w:t>
-      </w:r>
-      <w:r>
-        <w:rPr>
-          <w:rFonts w:ascii="Songti SC" w:hAnsi="Songti SC" w:eastAsia="Songti SC"/>
-          <w:b w:val="0"/>
-          <w:sz w:val="21"/>
-        </w:rPr>
-        <w:t>正确项：③立足福州实际，深刻认识并准确把握福州的特点和优势，④统筹全局、系统谋划，为高质量发展做好顶层设计</w:t>
-      </w:r>
-    </w:p>
-    <w:p>
-      <w:pPr>
-        <w:spacing w:after="40" w:line="259" w:lineRule="auto"/>
-        <w:ind w:left="312"/>
-      </w:pPr>
-      <w:r>
-        <w:rPr>
-          <w:rFonts w:ascii="Songti SC" w:hAnsi="Songti SC" w:eastAsia="Songti SC"/>
-          <w:b/>
-          <w:color w:val="1F4E79"/>
-          <w:sz w:val="20"/>
-        </w:rPr>
-        <w:t>相关材料：</w:t>
-      </w:r>
-      <w:r>
-        <w:rPr>
-          <w:rFonts w:ascii="Songti SC" w:hAnsi="Songti SC" w:eastAsia="Songti SC"/>
-          <w:b w:val="0"/>
-          <w:sz w:val="20"/>
-        </w:rPr>
-        <w:t>正确项③写“立足福州实际，深刻认识并准确把握福州的特点和优势”，④写“统筹全局、系统谋划，为高质量发展做好顶层设计”</w:t>
-      </w:r>
-    </w:p>
-    <w:p>
-      <w:pPr>
-        <w:spacing w:after="40" w:line="259" w:lineRule="auto"/>
-        <w:ind w:left="312"/>
-      </w:pPr>
-      <w:r>
-        <w:rPr>
-          <w:rFonts w:ascii="Songti SC" w:hAnsi="Songti SC" w:eastAsia="Songti SC"/>
-          <w:b/>
-          <w:color w:val="1F4E79"/>
-          <w:sz w:val="20"/>
-        </w:rPr>
-        <w:t>触发知识：</w:t>
-      </w:r>
-      <w:r>
-        <w:rPr>
-          <w:rFonts w:ascii="Songti SC" w:hAnsi="Songti SC" w:eastAsia="Songti SC"/>
-          <w:b w:val="0"/>
-          <w:sz w:val="20"/>
-        </w:rPr>
-        <w:t>一切从实际出发 / 实事求是</w:t>
-      </w:r>
-    </w:p>
-    <w:p>
-      <w:pPr>
-        <w:spacing w:after="40" w:line="259" w:lineRule="auto"/>
-        <w:ind w:left="312"/>
-      </w:pPr>
-      <w:r>
-        <w:rPr>
-          <w:rFonts w:ascii="Songti SC" w:hAnsi="Songti SC" w:eastAsia="Songti SC"/>
-          <w:b/>
-          <w:color w:val="1F4E79"/>
-          <w:sz w:val="20"/>
-        </w:rPr>
-        <w:t>为什么触发：</w:t>
-      </w:r>
-      <w:r>
-        <w:rPr>
-          <w:rFonts w:ascii="Songti SC" w:hAnsi="Songti SC" w:eastAsia="Songti SC"/>
-          <w:b w:val="0"/>
-          <w:sz w:val="20"/>
-        </w:rPr>
-        <w:t>真正触发一切从实际出发的是“立足福州实际”和“把握福州的特点和优势”：方案先贴住福州的具体市情、特点和优势，再形成发展规划。</w:t>
-      </w:r>
-    </w:p>
-    <w:p>
-      <w:pPr>
-        <w:spacing w:after="40" w:line="259" w:lineRule="auto"/>
-        <w:ind w:left="312"/>
-      </w:pPr>
-      <w:r>
-        <w:rPr>
-          <w:rFonts w:ascii="Songti SC" w:hAnsi="Songti SC" w:eastAsia="Songti SC"/>
-          <w:b/>
-          <w:color w:val="1F4E79"/>
-          <w:sz w:val="20"/>
-        </w:rPr>
-        <w:t>来源与证据：</w:t>
-      </w:r>
-      <w:r>
-        <w:rPr>
-          <w:rFonts w:ascii="Songti SC" w:hAnsi="Songti SC" w:eastAsia="Songti SC"/>
-          <w:b w:val="0"/>
-          <w:sz w:val="20"/>
-        </w:rPr>
-        <w:t>2024北京丰台高三一模 第8题；C选择题正确项；有可靠答案源</w:t>
-      </w:r>
-    </w:p>
-    <w:p>
-      <w:pPr>
-        <w:spacing w:before="100" w:after="40"/>
-      </w:pPr>
-      <w:r>
-        <w:rPr>
-          <w:rFonts w:ascii="Songti SC" w:hAnsi="Songti SC" w:eastAsia="Songti SC"/>
-          <w:b/>
-          <w:color w:val="1F4E79"/>
-          <w:sz w:val="21"/>
-        </w:rPr>
-        <w:t>6. 真正触发点：</w:t>
       </w:r>
       <w:r>
         <w:rPr>
@@ -1167,6 +1053,120 @@
           <w:color w:val="1F4E79"/>
           <w:sz w:val="21"/>
         </w:rPr>
+        <w:t>6. 真正触发点：</w:t>
+      </w:r>
+      <w:r>
+        <w:rPr>
+          <w:rFonts w:ascii="Songti SC" w:hAnsi="Songti SC" w:eastAsia="Songti SC"/>
+          <w:b w:val="0"/>
+          <w:sz w:val="21"/>
+        </w:rPr>
+        <w:t>正确项：一切从实际出发、实事求是是做好工作的前提</w:t>
+      </w:r>
+    </w:p>
+    <w:p>
+      <w:pPr>
+        <w:spacing w:after="40" w:line="259" w:lineRule="auto"/>
+        <w:ind w:left="312"/>
+      </w:pPr>
+      <w:r>
+        <w:rPr>
+          <w:rFonts w:ascii="Songti SC" w:hAnsi="Songti SC" w:eastAsia="Songti SC"/>
+          <w:b/>
+          <w:color w:val="1F4E79"/>
+          <w:sz w:val="20"/>
+        </w:rPr>
+        <w:t>相关材料：</w:t>
+      </w:r>
+      <w:r>
+        <w:rPr>
+          <w:rFonts w:ascii="Songti SC" w:hAnsi="Songti SC" w:eastAsia="Songti SC"/>
+          <w:b w:val="0"/>
+          <w:sz w:val="20"/>
+        </w:rPr>
+        <w:t>“指尖上的形式主义”让基层干部被工作群、打卡、报材料困扰，中央要求规范政务应用和工作群组，为基层治理减负增效</w:t>
+      </w:r>
+    </w:p>
+    <w:p>
+      <w:pPr>
+        <w:spacing w:after="40" w:line="259" w:lineRule="auto"/>
+        <w:ind w:left="312"/>
+      </w:pPr>
+      <w:r>
+        <w:rPr>
+          <w:rFonts w:ascii="Songti SC" w:hAnsi="Songti SC" w:eastAsia="Songti SC"/>
+          <w:b/>
+          <w:color w:val="1F4E79"/>
+          <w:sz w:val="20"/>
+        </w:rPr>
+        <w:t>触发知识：</w:t>
+      </w:r>
+      <w:r>
+        <w:rPr>
+          <w:rFonts w:ascii="Songti SC" w:hAnsi="Songti SC" w:eastAsia="Songti SC"/>
+          <w:b w:val="0"/>
+          <w:sz w:val="20"/>
+        </w:rPr>
+        <w:t>一切从实际出发 / 实事求是</w:t>
+      </w:r>
+    </w:p>
+    <w:p>
+      <w:pPr>
+        <w:spacing w:after="40" w:line="259" w:lineRule="auto"/>
+        <w:ind w:left="312"/>
+      </w:pPr>
+      <w:r>
+        <w:rPr>
+          <w:rFonts w:ascii="Songti SC" w:hAnsi="Songti SC" w:eastAsia="Songti SC"/>
+          <w:b/>
+          <w:color w:val="1F4E79"/>
+          <w:sz w:val="20"/>
+        </w:rPr>
+        <w:t>为什么触发：</w:t>
+      </w:r>
+      <w:r>
+        <w:rPr>
+          <w:rFonts w:ascii="Songti SC" w:hAnsi="Songti SC" w:eastAsia="Songti SC"/>
+          <w:b w:val="0"/>
+          <w:sz w:val="20"/>
+        </w:rPr>
+        <w:t>核心触发点是基层干部被工作群、打卡、报材料困扰：规范政务应用和工作群组，是从基层真实负担和治理效率问题出发。</w:t>
+      </w:r>
+    </w:p>
+    <w:p>
+      <w:pPr>
+        <w:spacing w:after="40" w:line="259" w:lineRule="auto"/>
+        <w:ind w:left="312"/>
+      </w:pPr>
+      <w:r>
+        <w:rPr>
+          <w:rFonts w:ascii="Songti SC" w:hAnsi="Songti SC" w:eastAsia="Songti SC"/>
+          <w:b/>
+          <w:color w:val="1F4E79"/>
+          <w:sz w:val="20"/>
+        </w:rPr>
+        <w:t>来源与证据：</w:t>
+      </w:r>
+      <w:r>
+        <w:rPr>
+          <w:rFonts w:ascii="Songti SC" w:hAnsi="Songti SC" w:eastAsia="Songti SC"/>
+          <w:b w:val="0"/>
+          <w:sz w:val="20"/>
+        </w:rPr>
+        <w:t>2024北京海淀高三二模 第4题；C选择题正确项；有可靠答案源</w:t>
+      </w:r>
+    </w:p>
+    <w:p>
+      <w:pPr>
+        <w:spacing w:before="100" w:after="40"/>
+      </w:pPr>
+      <w:r>
+        <w:rPr>
+          <w:rFonts w:ascii="Songti SC" w:hAnsi="Songti SC" w:eastAsia="Songti SC"/>
+          <w:b/>
+          <w:color w:val="1F4E79"/>
+          <w:sz w:val="21"/>
+        </w:rPr>
         <w:t>7. 真正触发点：</w:t>
       </w:r>
       <w:r>
@@ -1175,7 +1175,7 @@
           <w:b w:val="0"/>
           <w:sz w:val="21"/>
         </w:rPr>
-        <w:t>正确项：一切从实际出发、实事求是是做好工作的前提</w:t>
+        <w:t>正确项：科研院所、高校服务农业农村，以及走进乡土中国深处才能理解实事求是、联系群众</w:t>
       </w:r>
     </w:p>
     <w:p>
@@ -1198,7 +1198,7 @@
           <w:b w:val="0"/>
           <w:sz w:val="20"/>
         </w:rPr>
-        <w:t>“指尖上的形式主义”让基层干部被工作群、打卡、报材料困扰，中央要求规范政务应用和工作群组，为基层治理减负增效</w:t>
+        <w:t>科技小院一头连着师生，一头连着田间地头；学生在知识、理论学习基础上研究解决农业农村实际问题</w:t>
       </w:r>
     </w:p>
     <w:p>
@@ -1244,7 +1244,7 @@
           <w:b w:val="0"/>
           <w:sz w:val="20"/>
         </w:rPr>
-        <w:t>核心触发点是基层干部被工作群、打卡、报材料困扰：规范政务应用和工作群组，是从基层真实负担和治理效率问题出发。</w:t>
+        <w:t>核心触发词是“走进乡土中国深处、研究解决农业农村实际问题”：把理论放到田间地头、农民需要和农业问题中检验，才对应实事求是。</w:t>
       </w:r>
     </w:p>
     <w:p>
@@ -1267,7 +1267,7 @@
           <w:b w:val="0"/>
           <w:sz w:val="20"/>
         </w:rPr>
-        <w:t>2024北京海淀高三二模 第4题；C选择题正确项；有可靠答案源</w:t>
+        <w:t>2024北京西城高三一模 第2题；C选择题正确项；有可靠答案源</w:t>
       </w:r>
     </w:p>
     <w:p>
@@ -1289,7 +1289,7 @@
           <w:b w:val="0"/>
           <w:sz w:val="21"/>
         </w:rPr>
-        <w:t>正确项：科研院所、高校服务农业农村，以及走进乡土中国深处才能理解实事求是、联系群众</w:t>
+        <w:t>正确项：规划师因地制宜、知晓每处街巷矛盾特殊性，并实事求是重视新老居民生活方式焕新</w:t>
       </w:r>
     </w:p>
     <w:p>
@@ -1312,7 +1312,7 @@
           <w:b w:val="0"/>
           <w:sz w:val="20"/>
         </w:rPr>
-        <w:t>科技小院一头连着师生，一头连着田间地头；学生在知识、理论学习基础上研究解决农业农村实际问题</w:t>
+        <w:t>北京老城街巷治理拆除架空线、私搭乱建和乱停放，同时保留蓝天红墙、白塔、青砖灰瓦和胡同肌理</w:t>
       </w:r>
     </w:p>
     <w:p>
@@ -1358,7 +1358,7 @@
           <w:b w:val="0"/>
           <w:sz w:val="20"/>
         </w:rPr>
-        <w:t>核心触发词是“走进乡土中国深处、研究解决农业农村实际问题”：把理论放到田间地头、农民需要和农业问题中检验，才对应实事求是。</w:t>
+        <w:t>核心触发词是“因地制宜、每处街巷矛盾特殊性”：老城更新要依据不同街巷的空间、居民生活和文脉条件来定方案。</w:t>
       </w:r>
     </w:p>
     <w:p>
@@ -1381,7 +1381,7 @@
           <w:b w:val="0"/>
           <w:sz w:val="20"/>
         </w:rPr>
-        <w:t>2024北京西城高三一模 第2题；C选择题正确项；有可靠答案源</w:t>
+        <w:t>2024北京西城高三二模 第7题；C选择题正确项；有可靠答案源</w:t>
       </w:r>
     </w:p>
     <w:p>
@@ -1396,120 +1396,6 @@
           <w:sz w:val="21"/>
         </w:rPr>
         <w:t>9. 真正触发点：</w:t>
-      </w:r>
-      <w:r>
-        <w:rPr>
-          <w:rFonts w:ascii="Songti SC" w:hAnsi="Songti SC" w:eastAsia="Songti SC"/>
-          <w:b w:val="0"/>
-          <w:sz w:val="21"/>
-        </w:rPr>
-        <w:t>正确项：规划师因地制宜、知晓每处街巷矛盾特殊性，并实事求是重视新老居民生活方式焕新</w:t>
-      </w:r>
-    </w:p>
-    <w:p>
-      <w:pPr>
-        <w:spacing w:after="40" w:line="259" w:lineRule="auto"/>
-        <w:ind w:left="312"/>
-      </w:pPr>
-      <w:r>
-        <w:rPr>
-          <w:rFonts w:ascii="Songti SC" w:hAnsi="Songti SC" w:eastAsia="Songti SC"/>
-          <w:b/>
-          <w:color w:val="1F4E79"/>
-          <w:sz w:val="20"/>
-        </w:rPr>
-        <w:t>相关材料：</w:t>
-      </w:r>
-      <w:r>
-        <w:rPr>
-          <w:rFonts w:ascii="Songti SC" w:hAnsi="Songti SC" w:eastAsia="Songti SC"/>
-          <w:b w:val="0"/>
-          <w:sz w:val="20"/>
-        </w:rPr>
-        <w:t>北京老城街巷治理拆除架空线、私搭乱建和乱停放，同时保留蓝天红墙、白塔、青砖灰瓦和胡同肌理</w:t>
-      </w:r>
-    </w:p>
-    <w:p>
-      <w:pPr>
-        <w:spacing w:after="40" w:line="259" w:lineRule="auto"/>
-        <w:ind w:left="312"/>
-      </w:pPr>
-      <w:r>
-        <w:rPr>
-          <w:rFonts w:ascii="Songti SC" w:hAnsi="Songti SC" w:eastAsia="Songti SC"/>
-          <w:b/>
-          <w:color w:val="1F4E79"/>
-          <w:sz w:val="20"/>
-        </w:rPr>
-        <w:t>触发知识：</w:t>
-      </w:r>
-      <w:r>
-        <w:rPr>
-          <w:rFonts w:ascii="Songti SC" w:hAnsi="Songti SC" w:eastAsia="Songti SC"/>
-          <w:b w:val="0"/>
-          <w:sz w:val="20"/>
-        </w:rPr>
-        <w:t>一切从实际出发 / 实事求是</w:t>
-      </w:r>
-    </w:p>
-    <w:p>
-      <w:pPr>
-        <w:spacing w:after="40" w:line="259" w:lineRule="auto"/>
-        <w:ind w:left="312"/>
-      </w:pPr>
-      <w:r>
-        <w:rPr>
-          <w:rFonts w:ascii="Songti SC" w:hAnsi="Songti SC" w:eastAsia="Songti SC"/>
-          <w:b/>
-          <w:color w:val="1F4E79"/>
-          <w:sz w:val="20"/>
-        </w:rPr>
-        <w:t>为什么触发：</w:t>
-      </w:r>
-      <w:r>
-        <w:rPr>
-          <w:rFonts w:ascii="Songti SC" w:hAnsi="Songti SC" w:eastAsia="Songti SC"/>
-          <w:b w:val="0"/>
-          <w:sz w:val="20"/>
-        </w:rPr>
-        <w:t>核心触发词是“因地制宜、每处街巷矛盾特殊性”：老城更新要依据不同街巷的空间、居民生活和文脉条件来定方案。</w:t>
-      </w:r>
-    </w:p>
-    <w:p>
-      <w:pPr>
-        <w:spacing w:after="40" w:line="259" w:lineRule="auto"/>
-        <w:ind w:left="312"/>
-      </w:pPr>
-      <w:r>
-        <w:rPr>
-          <w:rFonts w:ascii="Songti SC" w:hAnsi="Songti SC" w:eastAsia="Songti SC"/>
-          <w:b/>
-          <w:color w:val="1F4E79"/>
-          <w:sz w:val="20"/>
-        </w:rPr>
-        <w:t>来源与证据：</w:t>
-      </w:r>
-      <w:r>
-        <w:rPr>
-          <w:rFonts w:ascii="Songti SC" w:hAnsi="Songti SC" w:eastAsia="Songti SC"/>
-          <w:b w:val="0"/>
-          <w:sz w:val="20"/>
-        </w:rPr>
-        <w:t>2024北京西城高三二模 第7题；C选择题正确项；有可靠答案源</w:t>
-      </w:r>
-    </w:p>
-    <w:p>
-      <w:pPr>
-        <w:spacing w:before="100" w:after="40"/>
-      </w:pPr>
-      <w:r>
-        <w:rPr>
-          <w:rFonts w:ascii="Songti SC" w:hAnsi="Songti SC" w:eastAsia="Songti SC"/>
-          <w:b/>
-          <w:color w:val="1F4E79"/>
-          <w:sz w:val="21"/>
-        </w:rPr>
-        <w:t>10. 真正触发点：</w:t>
       </w:r>
       <w:r>
         <w:rPr>
@@ -1640,7 +1526,7 @@
           <w:color w:val="1F4E79"/>
           <w:sz w:val="21"/>
         </w:rPr>
-        <w:t>11. 真正触发点：</w:t>
+        <w:t>10. 真正触发点：</w:t>
       </w:r>
       <w:r>
         <w:rPr>
@@ -1771,121 +1657,121 @@
           <w:color w:val="1F4E79"/>
           <w:sz w:val="21"/>
         </w:rPr>
+        <w:t>11. 真正触发点：</w:t>
+      </w:r>
+      <w:r>
+        <w:rPr>
+          <w:rFonts w:ascii="Songti SC" w:hAnsi="Songti SC" w:eastAsia="Songti SC"/>
+          <w:b w:val="0"/>
+          <w:sz w:val="21"/>
+        </w:rPr>
+        <w:t>正确项：延迟退休坚持自愿、弹性原则，房地产调控赋予地方自主权并允许有关城市因地制宜调整限购政策</w:t>
+      </w:r>
+    </w:p>
+    <w:p>
+      <w:pPr>
+        <w:spacing w:after="40" w:line="259" w:lineRule="auto"/>
+        <w:ind w:left="312"/>
+      </w:pPr>
+      <w:r>
+        <w:rPr>
+          <w:rFonts w:ascii="Songti SC" w:hAnsi="Songti SC" w:eastAsia="Songti SC"/>
+          <w:b/>
+          <w:color w:val="1F4E79"/>
+          <w:sz w:val="20"/>
+        </w:rPr>
+        <w:t>相关材料：</w:t>
+      </w:r>
+      <w:r>
+        <w:rPr>
+          <w:rFonts w:ascii="Songti SC" w:hAnsi="Songti SC" w:eastAsia="Songti SC"/>
+          <w:b w:val="0"/>
+          <w:sz w:val="20"/>
+        </w:rPr>
+        <w:t>延迟退休坚持自愿、弹性原则，房地产调控赋予地方自主权并允许有关城市因地制宜调整限购政策</w:t>
+      </w:r>
+    </w:p>
+    <w:p>
+      <w:pPr>
+        <w:spacing w:after="40" w:line="259" w:lineRule="auto"/>
+        <w:ind w:left="312"/>
+      </w:pPr>
+      <w:r>
+        <w:rPr>
+          <w:rFonts w:ascii="Songti SC" w:hAnsi="Songti SC" w:eastAsia="Songti SC"/>
+          <w:b/>
+          <w:color w:val="1F4E79"/>
+          <w:sz w:val="20"/>
+        </w:rPr>
+        <w:t>触发知识：</w:t>
+      </w:r>
+      <w:r>
+        <w:rPr>
+          <w:rFonts w:ascii="Songti SC" w:hAnsi="Songti SC" w:eastAsia="Songti SC"/>
+          <w:b w:val="0"/>
+          <w:sz w:val="20"/>
+        </w:rPr>
+        <w:t>一切从实际出发 / 实事求是</w:t>
+      </w:r>
+    </w:p>
+    <w:p>
+      <w:pPr>
+        <w:spacing w:after="40" w:line="259" w:lineRule="auto"/>
+        <w:ind w:left="312"/>
+      </w:pPr>
+      <w:r>
+        <w:rPr>
+          <w:rFonts w:ascii="Songti SC" w:hAnsi="Songti SC" w:eastAsia="Songti SC"/>
+          <w:b/>
+          <w:color w:val="1F4E79"/>
+          <w:sz w:val="20"/>
+        </w:rPr>
+        <w:t>为什么触发：</w:t>
+      </w:r>
+      <w:r>
+        <w:rPr>
+          <w:rFonts w:ascii="Songti SC" w:hAnsi="Songti SC" w:eastAsia="Songti SC"/>
+          <w:b w:val="0"/>
+          <w:sz w:val="20"/>
+        </w:rPr>
+        <w:t>触发点在“自愿、弹性、地方自主权、因地制宜”：延迟退休和房地产调控都按不同主体、不同地方的具体情况安排政策，所以可出实事求是和从实际出发。</w:t>
+      </w:r>
+    </w:p>
+    <w:p>
+      <w:pPr>
+        <w:spacing w:after="40" w:line="259" w:lineRule="auto"/>
+        <w:ind w:left="312"/>
+      </w:pPr>
+      <w:r>
+        <w:rPr>
+          <w:rFonts w:ascii="Songti SC" w:hAnsi="Songti SC" w:eastAsia="Songti SC"/>
+          <w:b/>
+          <w:color w:val="1F4E79"/>
+          <w:sz w:val="20"/>
+        </w:rPr>
+        <w:t>来源与证据：</w:t>
+      </w:r>
+      <w:r>
+        <w:rPr>
+          <w:rFonts w:ascii="Songti SC" w:hAnsi="Songti SC" w:eastAsia="Songti SC"/>
+          <w:b w:val="0"/>
+          <w:sz w:val="20"/>
+        </w:rPr>
+        <w:t>2025北京石景山高三一模 第4题；C选择题正确项；有可靠答案源</w:t>
+      </w:r>
+    </w:p>
+    <w:p>
+      <w:pPr>
+        <w:spacing w:before="100" w:after="40"/>
+      </w:pPr>
+      <w:r>
+        <w:rPr>
+          <w:rFonts w:ascii="Songti SC" w:hAnsi="Songti SC" w:eastAsia="Songti SC"/>
+          <w:b/>
+          <w:color w:val="1F4E79"/>
+          <w:sz w:val="21"/>
+        </w:rPr>
         <w:t>12. 真正触发点：</w:t>
-      </w:r>
-      <w:r>
-        <w:rPr>
-          <w:rFonts w:ascii="Songti SC" w:hAnsi="Songti SC" w:eastAsia="Songti SC"/>
-          <w:b w:val="0"/>
-          <w:sz w:val="21"/>
-        </w:rPr>
-        <w:t>正确项：延迟退休坚持自愿、弹性原则，房地产调控赋予地方自主权并允许有关城市因地制宜调整限购政策</w:t>
-      </w:r>
-    </w:p>
-    <w:p>
-      <w:pPr>
-        <w:spacing w:after="40" w:line="259" w:lineRule="auto"/>
-        <w:ind w:left="312"/>
-      </w:pPr>
-      <w:r>
-        <w:rPr>
-          <w:rFonts w:ascii="Songti SC" w:hAnsi="Songti SC" w:eastAsia="Songti SC"/>
-          <w:b/>
-          <w:color w:val="1F4E79"/>
-          <w:sz w:val="20"/>
-        </w:rPr>
-        <w:t>相关材料：</w:t>
-      </w:r>
-      <w:r>
-        <w:rPr>
-          <w:rFonts w:ascii="Songti SC" w:hAnsi="Songti SC" w:eastAsia="Songti SC"/>
-          <w:b w:val="0"/>
-          <w:sz w:val="20"/>
-        </w:rPr>
-        <w:t>延迟退休坚持自愿、弹性原则，房地产调控赋予地方自主权并允许有关城市因地制宜调整限购政策</w:t>
-      </w:r>
-    </w:p>
-    <w:p>
-      <w:pPr>
-        <w:spacing w:after="40" w:line="259" w:lineRule="auto"/>
-        <w:ind w:left="312"/>
-      </w:pPr>
-      <w:r>
-        <w:rPr>
-          <w:rFonts w:ascii="Songti SC" w:hAnsi="Songti SC" w:eastAsia="Songti SC"/>
-          <w:b/>
-          <w:color w:val="1F4E79"/>
-          <w:sz w:val="20"/>
-        </w:rPr>
-        <w:t>触发知识：</w:t>
-      </w:r>
-      <w:r>
-        <w:rPr>
-          <w:rFonts w:ascii="Songti SC" w:hAnsi="Songti SC" w:eastAsia="Songti SC"/>
-          <w:b w:val="0"/>
-          <w:sz w:val="20"/>
-        </w:rPr>
-        <w:t>一切从实际出发 / 实事求是</w:t>
-      </w:r>
-    </w:p>
-    <w:p>
-      <w:pPr>
-        <w:spacing w:after="40" w:line="259" w:lineRule="auto"/>
-        <w:ind w:left="312"/>
-      </w:pPr>
-      <w:r>
-        <w:rPr>
-          <w:rFonts w:ascii="Songti SC" w:hAnsi="Songti SC" w:eastAsia="Songti SC"/>
-          <w:b/>
-          <w:color w:val="1F4E79"/>
-          <w:sz w:val="20"/>
-        </w:rPr>
-        <w:t>为什么触发：</w:t>
-      </w:r>
-      <w:r>
-        <w:rPr>
-          <w:rFonts w:ascii="Songti SC" w:hAnsi="Songti SC" w:eastAsia="Songti SC"/>
-          <w:b w:val="0"/>
-          <w:sz w:val="20"/>
-        </w:rPr>
-        <w:t>触发点在“自愿、弹性、地方自主权、因地制宜”：延迟退休和房地产调控都按不同主体、不同地方的具体情况安排政策，所以可出实事求是和从实际出发。</w:t>
-      </w:r>
-    </w:p>
-    <w:p>
-      <w:pPr>
-        <w:spacing w:after="40" w:line="259" w:lineRule="auto"/>
-        <w:ind w:left="312"/>
-      </w:pPr>
-      <w:r>
-        <w:rPr>
-          <w:rFonts w:ascii="Songti SC" w:hAnsi="Songti SC" w:eastAsia="Songti SC"/>
-          <w:b/>
-          <w:color w:val="1F4E79"/>
-          <w:sz w:val="20"/>
-        </w:rPr>
-        <w:t>来源与证据：</w:t>
-      </w:r>
-      <w:r>
-        <w:rPr>
-          <w:rFonts w:ascii="Songti SC" w:hAnsi="Songti SC" w:eastAsia="Songti SC"/>
-          <w:b w:val="0"/>
-          <w:sz w:val="20"/>
-        </w:rPr>
-        <w:t>2025北京石景山高三一模 第4题；C选择题正确项；有可靠答案源</w:t>
-      </w:r>
-    </w:p>
-    <w:p>
-      <w:pPr>
-        <w:spacing w:before="100" w:after="40"/>
-      </w:pPr>
-      <w:r>
-        <w:rPr>
-          <w:rFonts w:ascii="Songti SC" w:hAnsi="Songti SC" w:eastAsia="Songti SC"/>
-          <w:b/>
-          <w:color w:val="1F4E79"/>
-          <w:sz w:val="21"/>
-        </w:rPr>
-        <w:t>13. 真正触发点：</w:t>
       </w:r>
       <w:r>
         <w:rPr>
@@ -2016,6 +1902,120 @@
           <w:color w:val="1F4E79"/>
           <w:sz w:val="21"/>
         </w:rPr>
+        <w:t>13. 真正触发点：</w:t>
+      </w:r>
+      <w:r>
+        <w:rPr>
+          <w:rFonts w:ascii="Songti SC" w:hAnsi="Songti SC" w:eastAsia="Songti SC"/>
+          <w:b w:val="0"/>
+          <w:sz w:val="21"/>
+        </w:rPr>
+        <w:t>正确项：数据要素与农业融合、因地制宜发展农业新质生产力</w:t>
+      </w:r>
+    </w:p>
+    <w:p>
+      <w:pPr>
+        <w:spacing w:after="40" w:line="259" w:lineRule="auto"/>
+        <w:ind w:left="312"/>
+      </w:pPr>
+      <w:r>
+        <w:rPr>
+          <w:rFonts w:ascii="Songti SC" w:hAnsi="Songti SC" w:eastAsia="Songti SC"/>
+          <w:b/>
+          <w:color w:val="1F4E79"/>
+          <w:sz w:val="20"/>
+        </w:rPr>
+        <w:t>相关材料：</w:t>
+      </w:r>
+      <w:r>
+        <w:rPr>
+          <w:rFonts w:ascii="Songti SC" w:hAnsi="Songti SC" w:eastAsia="Songti SC"/>
+          <w:b w:val="0"/>
+          <w:sz w:val="20"/>
+        </w:rPr>
+        <w:t>传感器深入农田、实时监测土壤，让农民根据数据对土壤健康状况精准判断，并指导农业种植</w:t>
+      </w:r>
+    </w:p>
+    <w:p>
+      <w:pPr>
+        <w:spacing w:after="40" w:line="259" w:lineRule="auto"/>
+        <w:ind w:left="312"/>
+      </w:pPr>
+      <w:r>
+        <w:rPr>
+          <w:rFonts w:ascii="Songti SC" w:hAnsi="Songti SC" w:eastAsia="Songti SC"/>
+          <w:b/>
+          <w:color w:val="1F4E79"/>
+          <w:sz w:val="20"/>
+        </w:rPr>
+        <w:t>触发知识：</w:t>
+      </w:r>
+      <w:r>
+        <w:rPr>
+          <w:rFonts w:ascii="Songti SC" w:hAnsi="Songti SC" w:eastAsia="Songti SC"/>
+          <w:b w:val="0"/>
+          <w:sz w:val="20"/>
+        </w:rPr>
+        <w:t>一切从实际出发 / 实事求是</w:t>
+      </w:r>
+    </w:p>
+    <w:p>
+      <w:pPr>
+        <w:spacing w:after="40" w:line="259" w:lineRule="auto"/>
+        <w:ind w:left="312"/>
+      </w:pPr>
+      <w:r>
+        <w:rPr>
+          <w:rFonts w:ascii="Songti SC" w:hAnsi="Songti SC" w:eastAsia="Songti SC"/>
+          <w:b/>
+          <w:color w:val="1F4E79"/>
+          <w:sz w:val="20"/>
+        </w:rPr>
+        <w:t>为什么触发：</w:t>
+      </w:r>
+      <w:r>
+        <w:rPr>
+          <w:rFonts w:ascii="Songti SC" w:hAnsi="Songti SC" w:eastAsia="Songti SC"/>
+          <w:b w:val="0"/>
+          <w:sz w:val="20"/>
+        </w:rPr>
+        <w:t>核心触发词是“传感器实时监测土壤”：农业判断先依据土壤数据和作物情况，再指导种植和发展农业新质生产力。</w:t>
+      </w:r>
+    </w:p>
+    <w:p>
+      <w:pPr>
+        <w:spacing w:after="40" w:line="259" w:lineRule="auto"/>
+        <w:ind w:left="312"/>
+      </w:pPr>
+      <w:r>
+        <w:rPr>
+          <w:rFonts w:ascii="Songti SC" w:hAnsi="Songti SC" w:eastAsia="Songti SC"/>
+          <w:b/>
+          <w:color w:val="1F4E79"/>
+          <w:sz w:val="20"/>
+        </w:rPr>
+        <w:t>来源与证据：</w:t>
+      </w:r>
+      <w:r>
+        <w:rPr>
+          <w:rFonts w:ascii="Songti SC" w:hAnsi="Songti SC" w:eastAsia="Songti SC"/>
+          <w:b w:val="0"/>
+          <w:sz w:val="20"/>
+        </w:rPr>
+        <w:t>2025北京顺义高三一模 第12题；C选择题正确项；有可靠答案源</w:t>
+      </w:r>
+    </w:p>
+    <w:p>
+      <w:pPr>
+        <w:spacing w:before="100" w:after="40"/>
+      </w:pPr>
+      <w:r>
+        <w:rPr>
+          <w:rFonts w:ascii="Songti SC" w:hAnsi="Songti SC" w:eastAsia="Songti SC"/>
+          <w:b/>
+          <w:color w:val="1F4E79"/>
+          <w:sz w:val="21"/>
+        </w:rPr>
         <w:t>14. 真正触发点：</w:t>
       </w:r>
       <w:r>
@@ -2024,7 +2024,7 @@
           <w:b w:val="0"/>
           <w:sz w:val="21"/>
         </w:rPr>
-        <w:t>正确项：数据要素与农业融合、因地制宜发展农业新质生产力</w:t>
+        <w:t>正确项：“集思广益”和“因地制宜”</w:t>
       </w:r>
     </w:p>
     <w:p>
@@ -2047,7 +2047,7 @@
           <w:b w:val="0"/>
           <w:sz w:val="20"/>
         </w:rPr>
-        <w:t>传感器深入农田、实时监测土壤，让农民根据数据对土壤健康状况精准判断，并指导农业种植</w:t>
+        <w:t>居民积极献言建策、共同参与社区微花园改造，微花园既贴近社区实际，又契合居民期待</w:t>
       </w:r>
     </w:p>
     <w:p>
@@ -2093,7 +2093,7 @@
           <w:b w:val="0"/>
           <w:sz w:val="20"/>
         </w:rPr>
-        <w:t>核心触发词是“传感器实时监测土壤”：农业判断先依据土壤数据和作物情况，再指导种植和发展农业新质生产力。</w:t>
+        <w:t>核心触发词是“集思广益、因地制宜”：微花园改造把居民意见和社区空间实际作为方案依据。</w:t>
       </w:r>
     </w:p>
     <w:p>
@@ -2116,7 +2116,7 @@
           <w:b w:val="0"/>
           <w:sz w:val="20"/>
         </w:rPr>
-        <w:t>2025北京顺义高三一模 第12题；C选择题正确项；有可靠答案源</w:t>
+        <w:t>2025北京顺义高三一模 第2题；C选择题正确项；有可靠答案源</w:t>
       </w:r>
     </w:p>
     <w:p>
@@ -2138,7 +2138,7 @@
           <w:b w:val="0"/>
           <w:sz w:val="21"/>
         </w:rPr>
-        <w:t>正确项：“集思广益”和“因地制宜”</w:t>
+        <w:t>正确项：面对复杂严峻的国内外环境，我国经济仍交出亮眼成绩单，材料强调只有从实际出发、实事求是，才能持续向新向优</w:t>
       </w:r>
     </w:p>
     <w:p>
@@ -2161,7 +2161,7 @@
           <w:b w:val="0"/>
           <w:sz w:val="20"/>
         </w:rPr>
-        <w:t>居民积极献言建策、共同参与社区微花园改造，微花园既贴近社区实际，又契合居民期待</w:t>
+        <w:t>面对复杂严峻的国内外环境，我国经济仍交出亮眼成绩单，材料强调只有从实际出发、实事求是，才能持续向新向优</w:t>
       </w:r>
     </w:p>
     <w:p>
@@ -2207,7 +2207,7 @@
           <w:b w:val="0"/>
           <w:sz w:val="20"/>
         </w:rPr>
-        <w:t>核心触发词是“集思广益、因地制宜”：微花园改造把居民意见和社区空间实际作为方案依据。</w:t>
+        <w:t>核心触发词是“复杂严峻的国内外环境”：经济判断和政策推进要依据国内外环境、发展基础和现实任务。</w:t>
       </w:r>
     </w:p>
     <w:p>
@@ -2230,7 +2230,7 @@
           <w:b w:val="0"/>
           <w:sz w:val="20"/>
         </w:rPr>
-        <w:t>2025北京顺义高三一模 第2题；C选择题正确项；有可靠答案源</w:t>
+        <w:t>2026北京东城高三一模 第1题；C选择题正确项；有可靠答案源</w:t>
       </w:r>
     </w:p>
     <w:p>
@@ -2252,7 +2252,7 @@
           <w:b w:val="0"/>
           <w:sz w:val="21"/>
         </w:rPr>
-        <w:t>正确项：面对复杂严峻的国内外环境，我国经济仍交出亮眼成绩单，材料强调只有从实际出发、实事求是，才能持续向新向优</w:t>
+        <w:t>正确项：前门商圈以“老字号+国潮”为特色，结合国粹体验、茉莉花茶文化推广和中轴线科技场景，推动城市由规模扩张转向内涵式发展</w:t>
       </w:r>
     </w:p>
     <w:p>
@@ -2275,7 +2275,7 @@
           <w:b w:val="0"/>
           <w:sz w:val="20"/>
         </w:rPr>
-        <w:t>面对复杂严峻的国内外环境，我国经济仍交出亮眼成绩单，材料强调只有从实际出发、实事求是，才能持续向新向优</w:t>
+        <w:t>前门商圈以“老字号+国潮”为特色，结合国粹体验、茉莉花茶文化推广和中轴线科技场景，推动城市由规模扩张转向内涵式发展</w:t>
       </w:r>
     </w:p>
     <w:p>
@@ -2321,7 +2321,7 @@
           <w:b w:val="0"/>
           <w:sz w:val="20"/>
         </w:rPr>
-        <w:t>核心触发词是“复杂严峻的国内外环境”：经济判断和政策推进要依据国内外环境、发展基础和现实任务。</w:t>
+        <w:t>核心触发词是“老字号+国潮、中轴线科技场景”：前门更新先抓自身历史文化资源和城市发展阶段，再推动内涵式发展。</w:t>
       </w:r>
     </w:p>
     <w:p>
@@ -2344,7 +2344,7 @@
           <w:b w:val="0"/>
           <w:sz w:val="20"/>
         </w:rPr>
-        <w:t>2026北京东城高三一模 第1题；C选择题正确项；有可靠答案源</w:t>
+        <w:t>2026北京朝阳高三（上）期中 第7题；C选择题正确项；有可靠答案源</w:t>
       </w:r>
     </w:p>
     <w:p>
@@ -2359,120 +2359,6 @@
           <w:sz w:val="21"/>
         </w:rPr>
         <w:t>17. 真正触发点：</w:t>
-      </w:r>
-      <w:r>
-        <w:rPr>
-          <w:rFonts w:ascii="Songti SC" w:hAnsi="Songti SC" w:eastAsia="Songti SC"/>
-          <w:b w:val="0"/>
-          <w:sz w:val="21"/>
-        </w:rPr>
-        <w:t>正确项：前门商圈以“老字号+国潮”为特色，结合国粹体验、茉莉花茶文化推广和中轴线科技场景，推动城市由规模扩张转向内涵式发展</w:t>
-      </w:r>
-    </w:p>
-    <w:p>
-      <w:pPr>
-        <w:spacing w:after="40" w:line="259" w:lineRule="auto"/>
-        <w:ind w:left="312"/>
-      </w:pPr>
-      <w:r>
-        <w:rPr>
-          <w:rFonts w:ascii="Songti SC" w:hAnsi="Songti SC" w:eastAsia="Songti SC"/>
-          <w:b/>
-          <w:color w:val="1F4E79"/>
-          <w:sz w:val="20"/>
-        </w:rPr>
-        <w:t>相关材料：</w:t>
-      </w:r>
-      <w:r>
-        <w:rPr>
-          <w:rFonts w:ascii="Songti SC" w:hAnsi="Songti SC" w:eastAsia="Songti SC"/>
-          <w:b w:val="0"/>
-          <w:sz w:val="20"/>
-        </w:rPr>
-        <w:t>前门商圈以“老字号+国潮”为特色，结合国粹体验、茉莉花茶文化推广和中轴线科技场景，推动城市由规模扩张转向内涵式发展</w:t>
-      </w:r>
-    </w:p>
-    <w:p>
-      <w:pPr>
-        <w:spacing w:after="40" w:line="259" w:lineRule="auto"/>
-        <w:ind w:left="312"/>
-      </w:pPr>
-      <w:r>
-        <w:rPr>
-          <w:rFonts w:ascii="Songti SC" w:hAnsi="Songti SC" w:eastAsia="Songti SC"/>
-          <w:b/>
-          <w:color w:val="1F4E79"/>
-          <w:sz w:val="20"/>
-        </w:rPr>
-        <w:t>触发知识：</w:t>
-      </w:r>
-      <w:r>
-        <w:rPr>
-          <w:rFonts w:ascii="Songti SC" w:hAnsi="Songti SC" w:eastAsia="Songti SC"/>
-          <w:b w:val="0"/>
-          <w:sz w:val="20"/>
-        </w:rPr>
-        <w:t>一切从实际出发 / 实事求是</w:t>
-      </w:r>
-    </w:p>
-    <w:p>
-      <w:pPr>
-        <w:spacing w:after="40" w:line="259" w:lineRule="auto"/>
-        <w:ind w:left="312"/>
-      </w:pPr>
-      <w:r>
-        <w:rPr>
-          <w:rFonts w:ascii="Songti SC" w:hAnsi="Songti SC" w:eastAsia="Songti SC"/>
-          <w:b/>
-          <w:color w:val="1F4E79"/>
-          <w:sz w:val="20"/>
-        </w:rPr>
-        <w:t>为什么触发：</w:t>
-      </w:r>
-      <w:r>
-        <w:rPr>
-          <w:rFonts w:ascii="Songti SC" w:hAnsi="Songti SC" w:eastAsia="Songti SC"/>
-          <w:b w:val="0"/>
-          <w:sz w:val="20"/>
-        </w:rPr>
-        <w:t>核心触发词是“老字号+国潮、中轴线科技场景”：前门更新先抓自身历史文化资源和城市发展阶段，再推动内涵式发展。</w:t>
-      </w:r>
-    </w:p>
-    <w:p>
-      <w:pPr>
-        <w:spacing w:after="40" w:line="259" w:lineRule="auto"/>
-        <w:ind w:left="312"/>
-      </w:pPr>
-      <w:r>
-        <w:rPr>
-          <w:rFonts w:ascii="Songti SC" w:hAnsi="Songti SC" w:eastAsia="Songti SC"/>
-          <w:b/>
-          <w:color w:val="1F4E79"/>
-          <w:sz w:val="20"/>
-        </w:rPr>
-        <w:t>来源与证据：</w:t>
-      </w:r>
-      <w:r>
-        <w:rPr>
-          <w:rFonts w:ascii="Songti SC" w:hAnsi="Songti SC" w:eastAsia="Songti SC"/>
-          <w:b w:val="0"/>
-          <w:sz w:val="20"/>
-        </w:rPr>
-        <w:t>2026北京朝阳高三（上）期中 第7题；C选择题正确项；有可靠答案源</w:t>
-      </w:r>
-    </w:p>
-    <w:p>
-      <w:pPr>
-        <w:spacing w:before="100" w:after="40"/>
-      </w:pPr>
-      <w:r>
-        <w:rPr>
-          <w:rFonts w:ascii="Songti SC" w:hAnsi="Songti SC" w:eastAsia="Songti SC"/>
-          <w:b/>
-          <w:color w:val="1F4E79"/>
-          <w:sz w:val="21"/>
-        </w:rPr>
-        <w:t>18. 真正触发点：</w:t>
       </w:r>
       <w:r>
         <w:rPr>
@@ -2603,7 +2489,7 @@
           <w:color w:val="1F4E79"/>
           <w:sz w:val="21"/>
         </w:rPr>
-        <w:t>19. 真正触发点：</w:t>
+        <w:t>18. 真正触发点：</w:t>
       </w:r>
       <w:r>
         <w:rPr>

</xml_diff>

<commit_message>
Downgrade Dongcheng Q21 actuality evidence
</commit_message>
<xml_diff>
--- a/reports/final_deliverables/必修四哲学_深层触发点版_2026-04-27/outputs/必修四哲学材料-知识触发总框架_深层触发点版_2026-04-27.docx
+++ b/reports/final_deliverables/必修四哲学_深层触发点版_2026-04-27/outputs/必修四哲学材料-知识触发总框架_深层触发点版_2026-04-27.docx
@@ -702,6 +702,120 @@
           <w:b w:val="0"/>
           <w:sz w:val="21"/>
         </w:rPr>
+        <w:t>段意触发：我国发展具备党的坚强领导、制度优势、持续快速发展和坚实基础、长期稳定社会环境、自信自强精神力量等战略性有利条件</w:t>
+      </w:r>
+    </w:p>
+    <w:p>
+      <w:pPr>
+        <w:spacing w:after="40" w:line="259" w:lineRule="auto"/>
+        <w:ind w:left="312"/>
+      </w:pPr>
+      <w:r>
+        <w:rPr>
+          <w:rFonts w:ascii="Songti SC" w:hAnsi="Songti SC" w:eastAsia="Songti SC"/>
+          <w:b/>
+          <w:color w:val="1F4E79"/>
+          <w:sz w:val="20"/>
+        </w:rPr>
+        <w:t>相关材料：</w:t>
+      </w:r>
+      <w:r>
+        <w:rPr>
+          <w:rFonts w:ascii="Songti SC" w:hAnsi="Songti SC" w:eastAsia="Songti SC"/>
+          <w:b w:val="0"/>
+          <w:sz w:val="20"/>
+        </w:rPr>
+        <w:t>我国发展具备党的坚强领导、制度优势、持续快速发展和坚实基础、长期稳定社会环境、自信自强精神力量等战略性有利条件</w:t>
+      </w:r>
+    </w:p>
+    <w:p>
+      <w:pPr>
+        <w:spacing w:after="40" w:line="259" w:lineRule="auto"/>
+        <w:ind w:left="312"/>
+      </w:pPr>
+      <w:r>
+        <w:rPr>
+          <w:rFonts w:ascii="Songti SC" w:hAnsi="Songti SC" w:eastAsia="Songti SC"/>
+          <w:b/>
+          <w:color w:val="1F4E79"/>
+          <w:sz w:val="20"/>
+        </w:rPr>
+        <w:t>触发知识：</w:t>
+      </w:r>
+      <w:r>
+        <w:rPr>
+          <w:rFonts w:ascii="Songti SC" w:hAnsi="Songti SC" w:eastAsia="Songti SC"/>
+          <w:b w:val="0"/>
+          <w:sz w:val="20"/>
+        </w:rPr>
+        <w:t>一切从实际出发 / 实事求是</w:t>
+      </w:r>
+    </w:p>
+    <w:p>
+      <w:pPr>
+        <w:spacing w:after="40" w:line="259" w:lineRule="auto"/>
+        <w:ind w:left="312"/>
+      </w:pPr>
+      <w:r>
+        <w:rPr>
+          <w:rFonts w:ascii="Songti SC" w:hAnsi="Songti SC" w:eastAsia="Songti SC"/>
+          <w:b/>
+          <w:color w:val="1F4E79"/>
+          <w:sz w:val="20"/>
+        </w:rPr>
+        <w:t>为什么触发：</w:t>
+      </w:r>
+      <w:r>
+        <w:rPr>
+          <w:rFonts w:ascii="Songti SC" w:hAnsi="Songti SC" w:eastAsia="Songti SC"/>
+          <w:b w:val="0"/>
+          <w:sz w:val="20"/>
+        </w:rPr>
+        <w:t>核心触发词是“战略性有利条件”：发展判断的依据落在党的领导、制度优势、物质基础、稳定环境和精神力量这些现实条件上。</w:t>
+      </w:r>
+    </w:p>
+    <w:p>
+      <w:pPr>
+        <w:spacing w:after="40" w:line="259" w:lineRule="auto"/>
+        <w:ind w:left="312"/>
+      </w:pPr>
+      <w:r>
+        <w:rPr>
+          <w:rFonts w:ascii="Songti SC" w:hAnsi="Songti SC" w:eastAsia="Songti SC"/>
+          <w:b/>
+          <w:color w:val="1F4E79"/>
+          <w:sz w:val="20"/>
+        </w:rPr>
+        <w:t>来源与证据：</w:t>
+      </w:r>
+      <w:r>
+        <w:rPr>
+          <w:rFonts w:ascii="Songti SC" w:hAnsi="Songti SC" w:eastAsia="Songti SC"/>
+          <w:b w:val="0"/>
+          <w:sz w:val="20"/>
+        </w:rPr>
+        <w:t>2024北京东城高三二模 第21题；B阅卷细则文字可支持（21题阅卷总结写“哲学角度可替措施环节，如中国实际出发、遵循社会发展规律等”）；PPT未列，非A级稳定细则点；材料链为整理者解释</w:t>
+      </w:r>
+    </w:p>
+    <w:p>
+      <w:pPr>
+        <w:spacing w:before="100" w:after="40"/>
+      </w:pPr>
+      <w:r>
+        <w:rPr>
+          <w:rFonts w:ascii="Songti SC" w:hAnsi="Songti SC" w:eastAsia="Songti SC"/>
+          <w:b/>
+          <w:color w:val="1F4E79"/>
+          <w:sz w:val="21"/>
+        </w:rPr>
+        <w:t>4. 真正触发点：</w:t>
+      </w:r>
+      <w:r>
+        <w:rPr>
+          <w:rFonts w:ascii="Songti SC" w:hAnsi="Songti SC" w:eastAsia="Songti SC"/>
+          <w:b w:val="0"/>
+          <w:sz w:val="21"/>
+        </w:rPr>
         <w:t>段意触发：当今世界面临不稳定性与不确定性，人类面临许多共同挑战，全人类共同价值契合时代发展需要</w:t>
       </w:r>
     </w:p>
@@ -808,7 +922,7 @@
           <w:color w:val="1F4E79"/>
           <w:sz w:val="21"/>
         </w:rPr>
-        <w:t>4. 真正触发点：</w:t>
+        <w:t>5. 真正触发点：</w:t>
       </w:r>
       <w:r>
         <w:rPr>
@@ -922,7 +1036,7 @@
           <w:color w:val="1F4E79"/>
           <w:sz w:val="21"/>
         </w:rPr>
-        <w:t>5. 真正触发点：</w:t>
+        <w:t>6. 真正触发点：</w:t>
       </w:r>
       <w:r>
         <w:rPr>
@@ -1053,7 +1167,7 @@
           <w:color w:val="1F4E79"/>
           <w:sz w:val="21"/>
         </w:rPr>
-        <w:t>6. 真正触发点：</w:t>
+        <w:t>7. 真正触发点：</w:t>
       </w:r>
       <w:r>
         <w:rPr>
@@ -1167,7 +1281,7 @@
           <w:color w:val="1F4E79"/>
           <w:sz w:val="21"/>
         </w:rPr>
-        <w:t>7. 真正触发点：</w:t>
+        <w:t>8. 真正触发点：</w:t>
       </w:r>
       <w:r>
         <w:rPr>
@@ -1281,7 +1395,7 @@
           <w:color w:val="1F4E79"/>
           <w:sz w:val="21"/>
         </w:rPr>
-        <w:t>8. 真正触发点：</w:t>
+        <w:t>9. 真正触发点：</w:t>
       </w:r>
       <w:r>
         <w:rPr>
@@ -1395,7 +1509,7 @@
           <w:color w:val="1F4E79"/>
           <w:sz w:val="21"/>
         </w:rPr>
-        <w:t>9. 真正触发点：</w:t>
+        <w:t>10. 真正触发点：</w:t>
       </w:r>
       <w:r>
         <w:rPr>
@@ -1526,7 +1640,7 @@
           <w:color w:val="1F4E79"/>
           <w:sz w:val="21"/>
         </w:rPr>
-        <w:t>10. 真正触发点：</w:t>
+        <w:t>11. 真正触发点：</w:t>
       </w:r>
       <w:r>
         <w:rPr>
@@ -1657,7 +1771,7 @@
           <w:color w:val="1F4E79"/>
           <w:sz w:val="21"/>
         </w:rPr>
-        <w:t>11. 真正触发点：</w:t>
+        <w:t>12. 真正触发点：</w:t>
       </w:r>
       <w:r>
         <w:rPr>
@@ -1771,7 +1885,7 @@
           <w:color w:val="1F4E79"/>
           <w:sz w:val="21"/>
         </w:rPr>
-        <w:t>12. 真正触发点：</w:t>
+        <w:t>13. 真正触发点：</w:t>
       </w:r>
       <w:r>
         <w:rPr>
@@ -1902,7 +2016,7 @@
           <w:color w:val="1F4E79"/>
           <w:sz w:val="21"/>
         </w:rPr>
-        <w:t>13. 真正触发点：</w:t>
+        <w:t>14. 真正触发点：</w:t>
       </w:r>
       <w:r>
         <w:rPr>
@@ -2016,7 +2130,7 @@
           <w:color w:val="1F4E79"/>
           <w:sz w:val="21"/>
         </w:rPr>
-        <w:t>14. 真正触发点：</w:t>
+        <w:t>15. 真正触发点：</w:t>
       </w:r>
       <w:r>
         <w:rPr>
@@ -2130,7 +2244,7 @@
           <w:color w:val="1F4E79"/>
           <w:sz w:val="21"/>
         </w:rPr>
-        <w:t>15. 真正触发点：</w:t>
+        <w:t>16. 真正触发点：</w:t>
       </w:r>
       <w:r>
         <w:rPr>
@@ -2244,7 +2358,7 @@
           <w:color w:val="1F4E79"/>
           <w:sz w:val="21"/>
         </w:rPr>
-        <w:t>16. 真正触发点：</w:t>
+        <w:t>17. 真正触发点：</w:t>
       </w:r>
       <w:r>
         <w:rPr>
@@ -2358,7 +2472,7 @@
           <w:color w:val="1F4E79"/>
           <w:sz w:val="21"/>
         </w:rPr>
-        <w:t>17. 真正触发点：</w:t>
+        <w:t>18. 真正触发点：</w:t>
       </w:r>
       <w:r>
         <w:rPr>
@@ -2489,7 +2603,7 @@
           <w:color w:val="1F4E79"/>
           <w:sz w:val="21"/>
         </w:rPr>
-        <w:t>18. 真正触发点：</w:t>
+        <w:t>19. 真正触发点：</w:t>
       </w:r>
       <w:r>
         <w:rPr>

</xml_diff>

<commit_message>
Sharpen Haidian memory trigger wording
</commit_message>
<xml_diff>
--- a/reports/final_deliverables/必修四哲学_深层触发点版_2026-04-27/outputs/必修四哲学材料-知识触发总框架_深层触发点版_2026-04-27.docx
+++ b/reports/final_deliverables/必修四哲学_深层触发点版_2026-04-27/outputs/必修四哲学材料-知识触发总框架_深层触发点版_2026-04-27.docx
@@ -6676,7 +6676,7 @@
           <w:b w:val="0"/>
           <w:sz w:val="21"/>
         </w:rPr>
-        <w:t>段意触发：整段核心意思：关于“还需要记忆大量知识吗”的讨论中，材料把记忆看作把不同信息联结整合、形成有意义网络的过程，并要求</w:t>
+        <w:t>原文：把不同信息联结整合，形成有意义的网络</w:t>
       </w:r>
     </w:p>
     <w:p>
@@ -6699,7 +6699,7 @@
           <w:b w:val="0"/>
           <w:sz w:val="20"/>
         </w:rPr>
-        <w:t>关于“还需要记忆大量知识吗”的讨论中，材料把记忆看作把不同信息联结整合、形成有意义网络的过程，并要求结合材料或个人体验论证</w:t>
+        <w:t>记忆并不是机械存储信息，而是把不同信息联结整合，形成有意义的网络</w:t>
       </w:r>
     </w:p>
     <w:p>
@@ -6745,7 +6745,7 @@
           <w:b w:val="0"/>
           <w:sz w:val="20"/>
         </w:rPr>
-        <w:t>核心触发词是“关于“还需要记忆大量知识吗”的讨论中，材料把记忆看作把不同信息联结整合、形成有意义网络的过程，并要求”：多个对象、条件或环节相互影响、相互支撑，学生要抓材料中的关系链。</w:t>
+        <w:t>核心触发词是“把不同信息联结整合”：记忆的价值不在堆放孤立信息，而在把不同信息放进相互关联中，形成可以理解和迁移的关系网络。</w:t>
       </w:r>
     </w:p>
     <w:p>
@@ -10786,7 +10786,7 @@
           <w:b w:val="0"/>
           <w:sz w:val="21"/>
         </w:rPr>
-        <w:t>段意触发：整段核心意思：关于“还需要记忆大量知识吗”的讨论中，材料把记忆看作把不同信息联结整合、形成有意义网络的过程，并要求</w:t>
+        <w:t>原文：把不同信息联结整合，形成有意义的网络</w:t>
       </w:r>
     </w:p>
     <w:p>
@@ -10809,7 +10809,7 @@
           <w:b w:val="0"/>
           <w:sz w:val="20"/>
         </w:rPr>
-        <w:t>关于“还需要记忆大量知识吗”的讨论中，材料把记忆看作把不同信息联结整合、形成有意义网络的过程，并要求结合材料或个人体验论证</w:t>
+        <w:t>记忆并不是机械存储信息，而是把不同信息联结整合，形成有意义的网络</w:t>
       </w:r>
     </w:p>
     <w:p>
@@ -10855,7 +10855,7 @@
           <w:b w:val="0"/>
           <w:sz w:val="20"/>
         </w:rPr>
-        <w:t>“关于“还需要记忆大量知识吗”的讨论中，材料把记忆看作把不同信息联结整合、形成有意义网络的过程，并要求”把多个要素放进整体布局或系统协同中理解，触发点是要素之间如何配合并服务整体功能。</w:t>
+        <w:t>核心触发词是“形成有意义的网络”：分散信息作为部分，只有被联结整合进知识网络，才形成更有意义的整体功能。</w:t>
       </w:r>
     </w:p>
     <w:p>

</xml_diff>